<commit_message>
docs: agregar casos de prueba y corregir reglas de validación
</commit_message>
<xml_diff>
--- a/documentos/Documento_Diseno_Iteracion_1_Grupo_4.docx
+++ b/documentos/Documento_Diseno_Iteracion_1_Grupo_4.docx
@@ -14,12 +14,12 @@
           <wp:inline distB="0" distT="0" distL="0" distR="0">
             <wp:extent cx="1809750" cy="876300"/>
             <wp:effectExtent b="0" l="0" r="0" t="0"/>
-            <wp:docPr descr="Logo Universidad CENFOTEC" id="11" name="image4.png"/>
+            <wp:docPr descr="Logo Universidad CENFOTEC" id="11" name="image5.png"/>
             <a:graphic>
               <a:graphicData uri="http://schemas.openxmlformats.org/drawingml/2006/picture">
                 <pic:pic>
                   <pic:nvPicPr>
-                    <pic:cNvPr descr="Logo Universidad CENFOTEC" id="0" name="image4.png"/>
+                    <pic:cNvPr descr="Logo Universidad CENFOTEC" id="0" name="image5.png"/>
                     <pic:cNvPicPr preferRelativeResize="0"/>
                   </pic:nvPicPr>
                   <pic:blipFill>
@@ -266,27 +266,27 @@
         <w:pageBreakBefore w:val="1"/>
         <w:spacing w:after="360" w:line="240" w:lineRule="auto"/>
         <w:jc w:val="both"/>
-        <w:rPr/>
-      </w:pPr>
-      <w:r>
         <w:rPr>
           <w:b w:val="1"/>
           <w:bCs w:val="1"/>
           <w:sz w:val="28"/>
           <w:szCs w:val="28"/>
+        </w:rPr>
+      </w:pPr>
+      <w:r>
+        <w:rPr>
+          <w:b w:val="1"/>
+          <w:bCs w:val="1"/>
+          <w:sz w:val="28"/>
+          <w:szCs w:val="28"/>
           <w:rtl w:val="0"/>
         </w:rPr>
         <w:t xml:space="preserve">Tabla de contenidos</w:t>
-      </w:r>
-      <w:r>
-        <w:rPr>
-          <w:rtl w:val="0"/>
-        </w:rPr>
       </w:r>
     </w:p>
     <w:sdt>
       <w:sdtPr>
-        <w:id w:val="-1591681282"/>
+        <w:id w:val="-771773304"/>
         <w:docPartObj>
           <w:docPartGallery w:val="Table of Contents"/>
           <w:docPartUnique w:val="1"/>
@@ -297,28 +297,19 @@
           <w:pPr>
             <w:widowControl w:val="0"/>
             <w:tabs>
-              <w:tab w:val="right" w:leader="none" w:pos="12000"/>
+              <w:tab w:val="right" w:leader="dot" w:pos="12000"/>
             </w:tabs>
             <w:spacing w:before="60" w:line="240" w:lineRule="auto"/>
             <w:rPr>
-              <w:rFonts w:ascii="Arial" w:cs="Arial" w:eastAsia="Arial" w:hAnsi="Arial"/>
               <w:b w:val="1"/>
               <w:bCs w:val="1"/>
-              <w:i w:val="0"/>
-              <w:iCs w:val="0"/>
-              <w:smallCaps w:val="0"/>
-              <w:strike w:val="0"/>
               <w:color w:val="000000"/>
-              <w:sz w:val="22"/>
-              <w:szCs w:val="22"/>
               <w:u w:val="none"/>
-              <w:shd w:fill="auto" w:val="clear"/>
-              <w:vertAlign w:val="baseline"/>
             </w:rPr>
           </w:pPr>
           <w:r>
             <w:fldChar w:fldCharType="begin"/>
-            <w:instrText xml:space="preserve"> TOC \h \u \z \t "Heading 1,1,Heading 2,2,"</w:instrText>
+            <w:instrText xml:space="preserve"> TOC \h \u \z \t "Heading 1,1,Heading 2,2,Heading 3,3,Heading 4,4,Heading 5,5,Heading 6,6,"</w:instrText>
             <w:fldChar w:fldCharType="separate"/>
           </w:r>
           <w:hyperlink w:anchor="">
@@ -354,24 +345,13 @@
           <w:pPr>
             <w:widowControl w:val="0"/>
             <w:tabs>
-              <w:tab w:val="right" w:leader="none" w:pos="12000"/>
+              <w:tab w:val="right" w:leader="dot" w:pos="12000"/>
             </w:tabs>
             <w:spacing w:before="60" w:line="240" w:lineRule="auto"/>
             <w:ind w:left="360" w:firstLine="0"/>
             <w:rPr>
-              <w:rFonts w:ascii="Arial" w:cs="Arial" w:eastAsia="Arial" w:hAnsi="Arial"/>
-              <w:b w:val="0"/>
-              <w:bCs w:val="0"/>
-              <w:i w:val="0"/>
-              <w:iCs w:val="0"/>
-              <w:smallCaps w:val="0"/>
-              <w:strike w:val="0"/>
               <w:color w:val="000000"/>
-              <w:sz w:val="22"/>
-              <w:szCs w:val="22"/>
               <w:u w:val="none"/>
-              <w:shd w:fill="auto" w:val="clear"/>
-              <w:vertAlign w:val="baseline"/>
             </w:rPr>
           </w:pPr>
           <w:hyperlink w:anchor="">
@@ -407,24 +387,13 @@
           <w:pPr>
             <w:widowControl w:val="0"/>
             <w:tabs>
-              <w:tab w:val="right" w:leader="none" w:pos="12000"/>
+              <w:tab w:val="right" w:leader="dot" w:pos="12000"/>
             </w:tabs>
             <w:spacing w:before="60" w:line="240" w:lineRule="auto"/>
             <w:ind w:left="360" w:firstLine="0"/>
             <w:rPr>
-              <w:rFonts w:ascii="Arial" w:cs="Arial" w:eastAsia="Arial" w:hAnsi="Arial"/>
-              <w:b w:val="0"/>
-              <w:bCs w:val="0"/>
-              <w:i w:val="0"/>
-              <w:iCs w:val="0"/>
-              <w:smallCaps w:val="0"/>
-              <w:strike w:val="0"/>
               <w:color w:val="000000"/>
-              <w:sz w:val="22"/>
-              <w:szCs w:val="22"/>
               <w:u w:val="none"/>
-              <w:shd w:fill="auto" w:val="clear"/>
-              <w:vertAlign w:val="baseline"/>
             </w:rPr>
           </w:pPr>
           <w:hyperlink w:anchor="">
@@ -460,24 +429,13 @@
           <w:pPr>
             <w:widowControl w:val="0"/>
             <w:tabs>
-              <w:tab w:val="right" w:leader="none" w:pos="12000"/>
+              <w:tab w:val="right" w:leader="dot" w:pos="12000"/>
             </w:tabs>
             <w:spacing w:before="60" w:line="240" w:lineRule="auto"/>
             <w:ind w:left="360" w:firstLine="0"/>
             <w:rPr>
-              <w:rFonts w:ascii="Arial" w:cs="Arial" w:eastAsia="Arial" w:hAnsi="Arial"/>
-              <w:b w:val="0"/>
-              <w:bCs w:val="0"/>
-              <w:i w:val="0"/>
-              <w:iCs w:val="0"/>
-              <w:smallCaps w:val="0"/>
-              <w:strike w:val="0"/>
               <w:color w:val="000000"/>
-              <w:sz w:val="22"/>
-              <w:szCs w:val="22"/>
               <w:u w:val="none"/>
-              <w:shd w:fill="auto" w:val="clear"/>
-              <w:vertAlign w:val="baseline"/>
             </w:rPr>
           </w:pPr>
           <w:hyperlink w:anchor="">
@@ -513,23 +471,14 @@
           <w:pPr>
             <w:widowControl w:val="0"/>
             <w:tabs>
-              <w:tab w:val="right" w:leader="none" w:pos="12000"/>
+              <w:tab w:val="right" w:leader="dot" w:pos="12000"/>
             </w:tabs>
             <w:spacing w:before="60" w:line="240" w:lineRule="auto"/>
             <w:rPr>
-              <w:rFonts w:ascii="Arial" w:cs="Arial" w:eastAsia="Arial" w:hAnsi="Arial"/>
               <w:b w:val="1"/>
               <w:bCs w:val="1"/>
-              <w:i w:val="0"/>
-              <w:iCs w:val="0"/>
-              <w:smallCaps w:val="0"/>
-              <w:strike w:val="0"/>
               <w:color w:val="000000"/>
-              <w:sz w:val="22"/>
-              <w:szCs w:val="22"/>
               <w:u w:val="none"/>
-              <w:shd w:fill="auto" w:val="clear"/>
-              <w:vertAlign w:val="baseline"/>
             </w:rPr>
           </w:pPr>
           <w:hyperlink w:anchor="">
@@ -565,24 +514,13 @@
           <w:pPr>
             <w:widowControl w:val="0"/>
             <w:tabs>
-              <w:tab w:val="right" w:leader="none" w:pos="12000"/>
+              <w:tab w:val="right" w:leader="dot" w:pos="12000"/>
             </w:tabs>
             <w:spacing w:before="60" w:line="240" w:lineRule="auto"/>
             <w:ind w:left="360" w:firstLine="0"/>
             <w:rPr>
-              <w:rFonts w:ascii="Arial" w:cs="Arial" w:eastAsia="Arial" w:hAnsi="Arial"/>
-              <w:b w:val="0"/>
-              <w:bCs w:val="0"/>
-              <w:i w:val="0"/>
-              <w:iCs w:val="0"/>
-              <w:smallCaps w:val="0"/>
-              <w:strike w:val="0"/>
               <w:color w:val="000000"/>
-              <w:sz w:val="22"/>
-              <w:szCs w:val="22"/>
               <w:u w:val="none"/>
-              <w:shd w:fill="auto" w:val="clear"/>
-              <w:vertAlign w:val="baseline"/>
             </w:rPr>
           </w:pPr>
           <w:hyperlink w:anchor="">
@@ -618,24 +556,13 @@
           <w:pPr>
             <w:widowControl w:val="0"/>
             <w:tabs>
-              <w:tab w:val="right" w:leader="none" w:pos="12000"/>
+              <w:tab w:val="right" w:leader="dot" w:pos="12000"/>
             </w:tabs>
             <w:spacing w:before="60" w:line="240" w:lineRule="auto"/>
             <w:ind w:left="360" w:firstLine="0"/>
             <w:rPr>
-              <w:rFonts w:ascii="Arial" w:cs="Arial" w:eastAsia="Arial" w:hAnsi="Arial"/>
-              <w:b w:val="0"/>
-              <w:bCs w:val="0"/>
-              <w:i w:val="0"/>
-              <w:iCs w:val="0"/>
-              <w:smallCaps w:val="0"/>
-              <w:strike w:val="0"/>
               <w:color w:val="000000"/>
-              <w:sz w:val="22"/>
-              <w:szCs w:val="22"/>
               <w:u w:val="none"/>
-              <w:shd w:fill="auto" w:val="clear"/>
-              <w:vertAlign w:val="baseline"/>
             </w:rPr>
           </w:pPr>
           <w:hyperlink w:anchor="">
@@ -671,24 +598,13 @@
           <w:pPr>
             <w:widowControl w:val="0"/>
             <w:tabs>
-              <w:tab w:val="right" w:leader="none" w:pos="12000"/>
+              <w:tab w:val="right" w:leader="dot" w:pos="12000"/>
             </w:tabs>
             <w:spacing w:before="60" w:line="240" w:lineRule="auto"/>
             <w:ind w:left="360" w:firstLine="0"/>
             <w:rPr>
-              <w:rFonts w:ascii="Arial" w:cs="Arial" w:eastAsia="Arial" w:hAnsi="Arial"/>
-              <w:b w:val="0"/>
-              <w:bCs w:val="0"/>
-              <w:i w:val="0"/>
-              <w:iCs w:val="0"/>
-              <w:smallCaps w:val="0"/>
-              <w:strike w:val="0"/>
               <w:color w:val="000000"/>
-              <w:sz w:val="22"/>
-              <w:szCs w:val="22"/>
               <w:u w:val="none"/>
-              <w:shd w:fill="auto" w:val="clear"/>
-              <w:vertAlign w:val="baseline"/>
             </w:rPr>
           </w:pPr>
           <w:hyperlink w:anchor="">
@@ -724,23 +640,14 @@
           <w:pPr>
             <w:widowControl w:val="0"/>
             <w:tabs>
-              <w:tab w:val="right" w:leader="none" w:pos="12000"/>
+              <w:tab w:val="right" w:leader="dot" w:pos="12000"/>
             </w:tabs>
             <w:spacing w:before="60" w:line="240" w:lineRule="auto"/>
             <w:rPr>
-              <w:rFonts w:ascii="Arial" w:cs="Arial" w:eastAsia="Arial" w:hAnsi="Arial"/>
               <w:b w:val="1"/>
               <w:bCs w:val="1"/>
-              <w:i w:val="0"/>
-              <w:iCs w:val="0"/>
-              <w:smallCaps w:val="0"/>
-              <w:strike w:val="0"/>
               <w:color w:val="000000"/>
-              <w:sz w:val="22"/>
-              <w:szCs w:val="22"/>
               <w:u w:val="none"/>
-              <w:shd w:fill="auto" w:val="clear"/>
-              <w:vertAlign w:val="baseline"/>
             </w:rPr>
           </w:pPr>
           <w:hyperlink w:anchor="">
@@ -776,24 +683,13 @@
           <w:pPr>
             <w:widowControl w:val="0"/>
             <w:tabs>
-              <w:tab w:val="right" w:leader="none" w:pos="12000"/>
+              <w:tab w:val="right" w:leader="dot" w:pos="12000"/>
             </w:tabs>
             <w:spacing w:before="60" w:line="240" w:lineRule="auto"/>
             <w:ind w:left="360" w:firstLine="0"/>
             <w:rPr>
-              <w:rFonts w:ascii="Arial" w:cs="Arial" w:eastAsia="Arial" w:hAnsi="Arial"/>
-              <w:b w:val="0"/>
-              <w:bCs w:val="0"/>
-              <w:i w:val="0"/>
-              <w:iCs w:val="0"/>
-              <w:smallCaps w:val="0"/>
-              <w:strike w:val="0"/>
               <w:color w:val="000000"/>
-              <w:sz w:val="22"/>
-              <w:szCs w:val="22"/>
               <w:u w:val="none"/>
-              <w:shd w:fill="auto" w:val="clear"/>
-              <w:vertAlign w:val="baseline"/>
             </w:rPr>
           </w:pPr>
           <w:hyperlink w:anchor="">
@@ -829,24 +725,13 @@
           <w:pPr>
             <w:widowControl w:val="0"/>
             <w:tabs>
-              <w:tab w:val="right" w:leader="none" w:pos="12000"/>
+              <w:tab w:val="right" w:leader="dot" w:pos="12000"/>
             </w:tabs>
             <w:spacing w:before="60" w:line="240" w:lineRule="auto"/>
             <w:ind w:left="360" w:firstLine="0"/>
             <w:rPr>
-              <w:rFonts w:ascii="Arial" w:cs="Arial" w:eastAsia="Arial" w:hAnsi="Arial"/>
-              <w:b w:val="0"/>
-              <w:bCs w:val="0"/>
-              <w:i w:val="0"/>
-              <w:iCs w:val="0"/>
-              <w:smallCaps w:val="0"/>
-              <w:strike w:val="0"/>
               <w:color w:val="000000"/>
-              <w:sz w:val="22"/>
-              <w:szCs w:val="22"/>
               <w:u w:val="none"/>
-              <w:shd w:fill="auto" w:val="clear"/>
-              <w:vertAlign w:val="baseline"/>
             </w:rPr>
           </w:pPr>
           <w:hyperlink w:anchor="">
@@ -882,23 +767,14 @@
           <w:pPr>
             <w:widowControl w:val="0"/>
             <w:tabs>
-              <w:tab w:val="right" w:leader="none" w:pos="12000"/>
+              <w:tab w:val="right" w:leader="dot" w:pos="12000"/>
             </w:tabs>
             <w:spacing w:before="60" w:line="240" w:lineRule="auto"/>
             <w:rPr>
-              <w:rFonts w:ascii="Arial" w:cs="Arial" w:eastAsia="Arial" w:hAnsi="Arial"/>
               <w:b w:val="1"/>
               <w:bCs w:val="1"/>
-              <w:i w:val="0"/>
-              <w:iCs w:val="0"/>
-              <w:smallCaps w:val="0"/>
-              <w:strike w:val="0"/>
               <w:color w:val="000000"/>
-              <w:sz w:val="22"/>
-              <w:szCs w:val="22"/>
               <w:u w:val="none"/>
-              <w:shd w:fill="auto" w:val="clear"/>
-              <w:vertAlign w:val="baseline"/>
             </w:rPr>
           </w:pPr>
           <w:hyperlink w:anchor="">
@@ -934,24 +810,13 @@
           <w:pPr>
             <w:widowControl w:val="0"/>
             <w:tabs>
-              <w:tab w:val="right" w:leader="none" w:pos="12000"/>
+              <w:tab w:val="right" w:leader="dot" w:pos="12000"/>
             </w:tabs>
             <w:spacing w:before="60" w:line="240" w:lineRule="auto"/>
             <w:ind w:left="360" w:firstLine="0"/>
             <w:rPr>
-              <w:rFonts w:ascii="Arial" w:cs="Arial" w:eastAsia="Arial" w:hAnsi="Arial"/>
-              <w:b w:val="0"/>
-              <w:bCs w:val="0"/>
-              <w:i w:val="0"/>
-              <w:iCs w:val="0"/>
-              <w:smallCaps w:val="0"/>
-              <w:strike w:val="0"/>
               <w:color w:val="000000"/>
-              <w:sz w:val="22"/>
-              <w:szCs w:val="22"/>
               <w:u w:val="none"/>
-              <w:shd w:fill="auto" w:val="clear"/>
-              <w:vertAlign w:val="baseline"/>
             </w:rPr>
           </w:pPr>
           <w:hyperlink w:anchor="">
@@ -987,24 +852,13 @@
           <w:pPr>
             <w:widowControl w:val="0"/>
             <w:tabs>
-              <w:tab w:val="right" w:leader="none" w:pos="12000"/>
+              <w:tab w:val="right" w:leader="dot" w:pos="12000"/>
             </w:tabs>
             <w:spacing w:before="60" w:line="240" w:lineRule="auto"/>
             <w:ind w:left="360" w:firstLine="0"/>
             <w:rPr>
-              <w:rFonts w:ascii="Arial" w:cs="Arial" w:eastAsia="Arial" w:hAnsi="Arial"/>
-              <w:b w:val="0"/>
-              <w:bCs w:val="0"/>
-              <w:i w:val="0"/>
-              <w:iCs w:val="0"/>
-              <w:smallCaps w:val="0"/>
-              <w:strike w:val="0"/>
               <w:color w:val="000000"/>
-              <w:sz w:val="22"/>
-              <w:szCs w:val="22"/>
               <w:u w:val="none"/>
-              <w:shd w:fill="auto" w:val="clear"/>
-              <w:vertAlign w:val="baseline"/>
             </w:rPr>
           </w:pPr>
           <w:hyperlink w:anchor="">
@@ -1040,23 +894,14 @@
           <w:pPr>
             <w:widowControl w:val="0"/>
             <w:tabs>
-              <w:tab w:val="right" w:leader="none" w:pos="12000"/>
+              <w:tab w:val="right" w:leader="dot" w:pos="12000"/>
             </w:tabs>
             <w:spacing w:before="60" w:line="240" w:lineRule="auto"/>
             <w:rPr>
-              <w:rFonts w:ascii="Arial" w:cs="Arial" w:eastAsia="Arial" w:hAnsi="Arial"/>
               <w:b w:val="1"/>
               <w:bCs w:val="1"/>
-              <w:i w:val="0"/>
-              <w:iCs w:val="0"/>
-              <w:smallCaps w:val="0"/>
-              <w:strike w:val="0"/>
               <w:color w:val="000000"/>
-              <w:sz w:val="22"/>
-              <w:szCs w:val="22"/>
               <w:u w:val="none"/>
-              <w:shd w:fill="auto" w:val="clear"/>
-              <w:vertAlign w:val="baseline"/>
             </w:rPr>
           </w:pPr>
           <w:hyperlink w:anchor="">
@@ -1092,23 +937,14 @@
           <w:pPr>
             <w:widowControl w:val="0"/>
             <w:tabs>
-              <w:tab w:val="right" w:leader="none" w:pos="12000"/>
+              <w:tab w:val="right" w:leader="dot" w:pos="12000"/>
             </w:tabs>
             <w:spacing w:before="60" w:line="240" w:lineRule="auto"/>
             <w:rPr>
-              <w:rFonts w:ascii="Arial" w:cs="Arial" w:eastAsia="Arial" w:hAnsi="Arial"/>
               <w:b w:val="1"/>
               <w:bCs w:val="1"/>
-              <w:i w:val="0"/>
-              <w:iCs w:val="0"/>
-              <w:smallCaps w:val="0"/>
-              <w:strike w:val="0"/>
               <w:color w:val="000000"/>
-              <w:sz w:val="22"/>
-              <w:szCs w:val="22"/>
               <w:u w:val="none"/>
-              <w:shd w:fill="auto" w:val="clear"/>
-              <w:vertAlign w:val="baseline"/>
             </w:rPr>
           </w:pPr>
           <w:hyperlink w:anchor="">
@@ -1144,23 +980,14 @@
           <w:pPr>
             <w:widowControl w:val="0"/>
             <w:tabs>
-              <w:tab w:val="right" w:leader="none" w:pos="12000"/>
+              <w:tab w:val="right" w:leader="dot" w:pos="12000"/>
             </w:tabs>
             <w:spacing w:before="60" w:line="240" w:lineRule="auto"/>
             <w:rPr>
-              <w:rFonts w:ascii="Arial" w:cs="Arial" w:eastAsia="Arial" w:hAnsi="Arial"/>
               <w:b w:val="1"/>
               <w:bCs w:val="1"/>
-              <w:i w:val="0"/>
-              <w:iCs w:val="0"/>
-              <w:smallCaps w:val="0"/>
-              <w:strike w:val="0"/>
               <w:color w:val="000000"/>
-              <w:sz w:val="22"/>
-              <w:szCs w:val="22"/>
               <w:u w:val="none"/>
-              <w:shd w:fill="auto" w:val="clear"/>
-              <w:vertAlign w:val="baseline"/>
             </w:rPr>
           </w:pPr>
           <w:hyperlink w:anchor="">
@@ -1196,24 +1023,13 @@
           <w:pPr>
             <w:widowControl w:val="0"/>
             <w:tabs>
-              <w:tab w:val="right" w:leader="none" w:pos="12000"/>
+              <w:tab w:val="right" w:leader="dot" w:pos="12000"/>
             </w:tabs>
             <w:spacing w:before="60" w:line="240" w:lineRule="auto"/>
             <w:ind w:left="360" w:firstLine="0"/>
             <w:rPr>
-              <w:rFonts w:ascii="Arial" w:cs="Arial" w:eastAsia="Arial" w:hAnsi="Arial"/>
-              <w:b w:val="0"/>
-              <w:bCs w:val="0"/>
-              <w:i w:val="0"/>
-              <w:iCs w:val="0"/>
-              <w:smallCaps w:val="0"/>
-              <w:strike w:val="0"/>
               <w:color w:val="000000"/>
-              <w:sz w:val="22"/>
-              <w:szCs w:val="22"/>
               <w:u w:val="none"/>
-              <w:shd w:fill="auto" w:val="clear"/>
-              <w:vertAlign w:val="baseline"/>
             </w:rPr>
           </w:pPr>
           <w:hyperlink w:anchor="">
@@ -1249,24 +1065,13 @@
           <w:pPr>
             <w:widowControl w:val="0"/>
             <w:tabs>
-              <w:tab w:val="right" w:leader="none" w:pos="12000"/>
+              <w:tab w:val="right" w:leader="dot" w:pos="12000"/>
             </w:tabs>
             <w:spacing w:before="60" w:line="240" w:lineRule="auto"/>
             <w:ind w:left="360" w:firstLine="0"/>
             <w:rPr>
-              <w:rFonts w:ascii="Arial" w:cs="Arial" w:eastAsia="Arial" w:hAnsi="Arial"/>
-              <w:b w:val="0"/>
-              <w:bCs w:val="0"/>
-              <w:i w:val="0"/>
-              <w:iCs w:val="0"/>
-              <w:smallCaps w:val="0"/>
-              <w:strike w:val="0"/>
               <w:color w:val="000000"/>
-              <w:sz w:val="22"/>
-              <w:szCs w:val="22"/>
               <w:u w:val="none"/>
-              <w:shd w:fill="auto" w:val="clear"/>
-              <w:vertAlign w:val="baseline"/>
             </w:rPr>
           </w:pPr>
           <w:hyperlink w:anchor="">
@@ -1302,24 +1107,13 @@
           <w:pPr>
             <w:widowControl w:val="0"/>
             <w:tabs>
-              <w:tab w:val="right" w:leader="none" w:pos="12000"/>
+              <w:tab w:val="right" w:leader="dot" w:pos="12000"/>
             </w:tabs>
             <w:spacing w:before="60" w:line="240" w:lineRule="auto"/>
             <w:ind w:left="360" w:firstLine="0"/>
             <w:rPr>
-              <w:rFonts w:ascii="Arial" w:cs="Arial" w:eastAsia="Arial" w:hAnsi="Arial"/>
-              <w:b w:val="0"/>
-              <w:bCs w:val="0"/>
-              <w:i w:val="0"/>
-              <w:iCs w:val="0"/>
-              <w:smallCaps w:val="0"/>
-              <w:strike w:val="0"/>
               <w:color w:val="000000"/>
-              <w:sz w:val="22"/>
-              <w:szCs w:val="22"/>
               <w:u w:val="none"/>
-              <w:shd w:fill="auto" w:val="clear"/>
-              <w:vertAlign w:val="baseline"/>
             </w:rPr>
           </w:pPr>
           <w:hyperlink w:anchor="">
@@ -1342,7 +1136,7 @@
               </w:rPr>
               <w:t xml:space="preserve">7.3 Lógica / pseudocódigo</w:t>
               <w:tab/>
-              <w:t xml:space="preserve">28</w:t>
+              <w:t xml:space="preserve">29</w:t>
             </w:r>
           </w:hyperlink>
           <w:r>
@@ -1355,23 +1149,14 @@
           <w:pPr>
             <w:widowControl w:val="0"/>
             <w:tabs>
-              <w:tab w:val="right" w:leader="none" w:pos="12000"/>
+              <w:tab w:val="right" w:leader="dot" w:pos="12000"/>
             </w:tabs>
             <w:spacing w:before="60" w:line="240" w:lineRule="auto"/>
             <w:rPr>
-              <w:rFonts w:ascii="Arial" w:cs="Arial" w:eastAsia="Arial" w:hAnsi="Arial"/>
               <w:b w:val="1"/>
               <w:bCs w:val="1"/>
-              <w:i w:val="0"/>
-              <w:iCs w:val="0"/>
-              <w:smallCaps w:val="0"/>
-              <w:strike w:val="0"/>
               <w:color w:val="000000"/>
-              <w:sz w:val="22"/>
-              <w:szCs w:val="22"/>
               <w:u w:val="none"/>
-              <w:shd w:fill="auto" w:val="clear"/>
-              <w:vertAlign w:val="baseline"/>
             </w:rPr>
           </w:pPr>
           <w:hyperlink w:anchor="">
@@ -1394,7 +1179,7 @@
               </w:rPr>
               <w:t xml:space="preserve">8. Casos de Prueba</w:t>
               <w:tab/>
-              <w:t xml:space="preserve">29</w:t>
+              <w:t xml:space="preserve">30</w:t>
             </w:r>
           </w:hyperlink>
           <w:r>
@@ -1407,23 +1192,14 @@
           <w:pPr>
             <w:widowControl w:val="0"/>
             <w:tabs>
-              <w:tab w:val="right" w:leader="none" w:pos="12000"/>
+              <w:tab w:val="right" w:leader="dot" w:pos="12000"/>
             </w:tabs>
             <w:spacing w:before="60" w:line="240" w:lineRule="auto"/>
             <w:rPr>
-              <w:rFonts w:ascii="Arial" w:cs="Arial" w:eastAsia="Arial" w:hAnsi="Arial"/>
               <w:b w:val="1"/>
               <w:bCs w:val="1"/>
-              <w:i w:val="0"/>
-              <w:iCs w:val="0"/>
-              <w:smallCaps w:val="0"/>
-              <w:strike w:val="0"/>
               <w:color w:val="000000"/>
-              <w:sz w:val="22"/>
-              <w:szCs w:val="22"/>
               <w:u w:val="none"/>
-              <w:shd w:fill="auto" w:val="clear"/>
-              <w:vertAlign w:val="baseline"/>
             </w:rPr>
           </w:pPr>
           <w:hyperlink w:anchor="">
@@ -1446,7 +1222,7 @@
               </w:rPr>
               <w:t xml:space="preserve">9. Plan de Trabajo y Responsabilidades</w:t>
               <w:tab/>
-              <w:t xml:space="preserve">30</w:t>
+              <w:t xml:space="preserve">31</w:t>
             </w:r>
           </w:hyperlink>
           <w:r>
@@ -1459,23 +1235,14 @@
           <w:pPr>
             <w:widowControl w:val="0"/>
             <w:tabs>
-              <w:tab w:val="right" w:leader="none" w:pos="12000"/>
+              <w:tab w:val="right" w:leader="dot" w:pos="12000"/>
             </w:tabs>
             <w:spacing w:before="60" w:line="240" w:lineRule="auto"/>
             <w:rPr>
-              <w:rFonts w:ascii="Arial" w:cs="Arial" w:eastAsia="Arial" w:hAnsi="Arial"/>
               <w:b w:val="1"/>
               <w:bCs w:val="1"/>
-              <w:i w:val="0"/>
-              <w:iCs w:val="0"/>
-              <w:smallCaps w:val="0"/>
-              <w:strike w:val="0"/>
               <w:color w:val="000000"/>
-              <w:sz w:val="22"/>
-              <w:szCs w:val="22"/>
               <w:u w:val="none"/>
-              <w:shd w:fill="auto" w:val="clear"/>
-              <w:vertAlign w:val="baseline"/>
             </w:rPr>
           </w:pPr>
           <w:hyperlink w:anchor="">
@@ -1498,7 +1265,7 @@
               </w:rPr>
               <w:t xml:space="preserve">10. Referencias</w:t>
               <w:tab/>
-              <w:t xml:space="preserve">31</w:t>
+              <w:t xml:space="preserve">32</w:t>
             </w:r>
           </w:hyperlink>
           <w:r>
@@ -1511,23 +1278,14 @@
           <w:pPr>
             <w:widowControl w:val="0"/>
             <w:tabs>
-              <w:tab w:val="right" w:leader="none" w:pos="12000"/>
+              <w:tab w:val="right" w:leader="dot" w:pos="12000"/>
             </w:tabs>
             <w:spacing w:before="60" w:line="240" w:lineRule="auto"/>
             <w:rPr>
-              <w:rFonts w:ascii="Arial" w:cs="Arial" w:eastAsia="Arial" w:hAnsi="Arial"/>
               <w:b w:val="1"/>
               <w:bCs w:val="1"/>
-              <w:i w:val="0"/>
-              <w:iCs w:val="0"/>
-              <w:smallCaps w:val="0"/>
-              <w:strike w:val="0"/>
               <w:color w:val="000000"/>
-              <w:sz w:val="22"/>
-              <w:szCs w:val="22"/>
               <w:u w:val="none"/>
-              <w:shd w:fill="auto" w:val="clear"/>
-              <w:vertAlign w:val="baseline"/>
             </w:rPr>
           </w:pPr>
           <w:hyperlink w:anchor="">
@@ -1550,7 +1308,7 @@
               </w:rPr>
               <w:t xml:space="preserve">11. Apéndices</w:t>
               <w:tab/>
-              <w:t xml:space="preserve">32</w:t>
+              <w:t xml:space="preserve">33</w:t>
             </w:r>
           </w:hyperlink>
           <w:r>
@@ -1566,11 +1324,38 @@
     </w:sdt>
     <w:p>
       <w:pPr>
+        <w:spacing w:after="360" w:line="240" w:lineRule="auto"/>
+        <w:jc w:val="both"/>
+        <w:rPr>
+          <w:b w:val="1"/>
+          <w:bCs w:val="1"/>
+          <w:sz w:val="28"/>
+          <w:szCs w:val="28"/>
+        </w:rPr>
+      </w:pPr>
+      <w:r>
+        <w:rPr>
+          <w:rtl w:val="0"/>
+        </w:rPr>
+      </w:r>
+    </w:p>
+    <w:p>
+      <w:pPr>
         <w:pStyle w:val="Heading1"/>
-        <w:keepLines w:val="0"/>
-        <w:pageBreakBefore w:val="1"/>
-        <w:spacing w:after="240" w:before="0" w:line="240" w:lineRule="auto"/>
-        <w:jc w:val="both"/>
+        <w:rPr/>
+      </w:pPr>
+      <w:r>
+        <w:br w:type="page"/>
+      </w:r>
+      <w:r>
+        <w:rPr>
+          <w:rtl w:val="0"/>
+        </w:rPr>
+      </w:r>
+    </w:p>
+    <w:p>
+      <w:pPr>
+        <w:pStyle w:val="Heading1"/>
         <w:rPr>
           <w:b w:val="1"/>
           <w:bCs w:val="1"/>
@@ -5827,12 +5612,12 @@
           <wp:inline distB="0" distT="0" distL="0" distR="0">
             <wp:extent cx="5619750" cy="3467100"/>
             <wp:effectExtent b="0" l="0" r="0" t="0"/>
-            <wp:docPr descr="Página de inicio de sesión (index.html)" id="7" name="image1.png"/>
+            <wp:docPr descr="Página de inicio de sesión (index.html)" id="7" name="image2.png"/>
             <a:graphic>
               <a:graphicData uri="http://schemas.openxmlformats.org/drawingml/2006/picture">
                 <pic:pic>
                   <pic:nvPicPr>
-                    <pic:cNvPr descr="Página de inicio de sesión (index.html)" id="0" name="image1.png"/>
+                    <pic:cNvPr descr="Página de inicio de sesión (index.html)" id="0" name="image2.png"/>
                     <pic:cNvPicPr preferRelativeResize="0"/>
                   </pic:nvPicPr>
                   <pic:blipFill>
@@ -5947,12 +5732,12 @@
           <wp:inline distB="0" distT="0" distL="0" distR="0">
             <wp:extent cx="5619750" cy="3286125"/>
             <wp:effectExtent b="0" l="0" r="0" t="0"/>
-            <wp:docPr descr="Panel de inicio (inicio.html)" id="1" name="image9.png"/>
+            <wp:docPr descr="Panel de inicio (inicio.html)" id="1" name="image12.png"/>
             <a:graphic>
               <a:graphicData uri="http://schemas.openxmlformats.org/drawingml/2006/picture">
                 <pic:pic>
                   <pic:nvPicPr>
-                    <pic:cNvPr descr="Panel de inicio (inicio.html)" id="0" name="image9.png"/>
+                    <pic:cNvPr descr="Panel de inicio (inicio.html)" id="0" name="image12.png"/>
                     <pic:cNvPicPr preferRelativeResize="0"/>
                   </pic:nvPicPr>
                   <pic:blipFill>
@@ -6067,12 +5852,12 @@
           <wp:inline distB="0" distT="0" distL="0" distR="0">
             <wp:extent cx="5619750" cy="4781550"/>
             <wp:effectExtent b="0" l="0" r="0" t="0"/>
-            <wp:docPr descr="Gestión de usuarios (usuarios.html)" id="4" name="image8.png"/>
+            <wp:docPr descr="Gestión de usuarios (usuarios.html)" id="4" name="image9.png"/>
             <a:graphic>
               <a:graphicData uri="http://schemas.openxmlformats.org/drawingml/2006/picture">
                 <pic:pic>
                   <pic:nvPicPr>
-                    <pic:cNvPr descr="Gestión de usuarios (usuarios.html)" id="0" name="image8.png"/>
+                    <pic:cNvPr descr="Gestión de usuarios (usuarios.html)" id="0" name="image9.png"/>
                     <pic:cNvPicPr preferRelativeResize="0"/>
                   </pic:nvPicPr>
                   <pic:blipFill>
@@ -6187,12 +5972,12 @@
           <wp:inline distB="0" distT="0" distL="0" distR="0">
             <wp:extent cx="5619750" cy="3552825"/>
             <wp:effectExtent b="0" l="0" r="0" t="0"/>
-            <wp:docPr descr="Perfil del usuario (perfil.html)" id="2" name="image12.png"/>
+            <wp:docPr descr="Perfil del usuario (perfil.html)" id="2" name="image4.png"/>
             <a:graphic>
               <a:graphicData uri="http://schemas.openxmlformats.org/drawingml/2006/picture">
                 <pic:pic>
                   <pic:nvPicPr>
-                    <pic:cNvPr descr="Perfil del usuario (perfil.html)" id="0" name="image12.png"/>
+                    <pic:cNvPr descr="Perfil del usuario (perfil.html)" id="0" name="image4.png"/>
                     <pic:cNvPicPr preferRelativeResize="0"/>
                   </pic:nvPicPr>
                   <pic:blipFill>
@@ -6307,12 +6092,12 @@
           <wp:inline distB="0" distT="0" distL="0" distR="0">
             <wp:extent cx="5619750" cy="3638550"/>
             <wp:effectExtent b="0" l="0" r="0" t="0"/>
-            <wp:docPr descr="Gestión de catálogos (catalogos.html)" id="10" name="image2.png"/>
+            <wp:docPr descr="Gestión de catálogos (catalogos.html)" id="10" name="image10.png"/>
             <a:graphic>
               <a:graphicData uri="http://schemas.openxmlformats.org/drawingml/2006/picture">
                 <pic:pic>
                   <pic:nvPicPr>
-                    <pic:cNvPr descr="Gestión de catálogos (catalogos.html)" id="0" name="image2.png"/>
+                    <pic:cNvPr descr="Gestión de catálogos (catalogos.html)" id="0" name="image10.png"/>
                     <pic:cNvPicPr preferRelativeResize="0"/>
                   </pic:nvPicPr>
                   <pic:blipFill>
@@ -6427,12 +6212,12 @@
           <wp:inline distB="0" distT="0" distL="0" distR="0">
             <wp:extent cx="5619750" cy="5562600"/>
             <wp:effectExtent b="0" l="0" r="0" t="0"/>
-            <wp:docPr descr="Formulario del curso, parte 1 de 2 (curso-formulario.html)" id="9" name="image6.png"/>
+            <wp:docPr descr="Formulario del curso, parte 1 de 2 (curso-formulario.html)" id="9" name="image3.png"/>
             <a:graphic>
               <a:graphicData uri="http://schemas.openxmlformats.org/drawingml/2006/picture">
                 <pic:pic>
                   <pic:nvPicPr>
-                    <pic:cNvPr descr="Formulario del curso, parte 1 de 2 (curso-formulario.html)" id="0" name="image6.png"/>
+                    <pic:cNvPr descr="Formulario del curso, parte 1 de 2 (curso-formulario.html)" id="0" name="image3.png"/>
                     <pic:cNvPicPr preferRelativeResize="0"/>
                   </pic:nvPicPr>
                   <pic:blipFill>
@@ -6547,12 +6332,12 @@
           <wp:inline distB="0" distT="0" distL="0" distR="0">
             <wp:extent cx="5619750" cy="6200775"/>
             <wp:effectExtent b="0" l="0" r="0" t="0"/>
-            <wp:docPr descr="Formulario del curso, parte 2 de 2 (curso-formulario.html)" id="3" name="image5.png"/>
+            <wp:docPr descr="Formulario del curso, parte 2 de 2 (curso-formulario.html)" id="3" name="image1.png"/>
             <a:graphic>
               <a:graphicData uri="http://schemas.openxmlformats.org/drawingml/2006/picture">
                 <pic:pic>
                   <pic:nvPicPr>
-                    <pic:cNvPr descr="Formulario del curso, parte 2 de 2 (curso-formulario.html)" id="0" name="image5.png"/>
+                    <pic:cNvPr descr="Formulario del curso, parte 2 de 2 (curso-formulario.html)" id="0" name="image1.png"/>
                     <pic:cNvPicPr preferRelativeResize="0"/>
                   </pic:nvPicPr>
                   <pic:blipFill>
@@ -6667,12 +6452,12 @@
           <wp:inline distB="0" distT="0" distL="0" distR="0">
             <wp:extent cx="5619750" cy="2933700"/>
             <wp:effectExtent b="0" l="0" r="0" t="0"/>
-            <wp:docPr descr="Lista de cursos con filtros (cursos.html)" id="8" name="image10.png"/>
+            <wp:docPr descr="Lista de cursos con filtros (cursos.html)" id="8" name="image7.png"/>
             <a:graphic>
               <a:graphicData uri="http://schemas.openxmlformats.org/drawingml/2006/picture">
                 <pic:pic>
                   <pic:nvPicPr>
-                    <pic:cNvPr descr="Lista de cursos con filtros (cursos.html)" id="0" name="image10.png"/>
+                    <pic:cNvPr descr="Lista de cursos con filtros (cursos.html)" id="0" name="image7.png"/>
                     <pic:cNvPicPr preferRelativeResize="0"/>
                   </pic:nvPicPr>
                   <pic:blipFill>
@@ -6787,12 +6572,12 @@
           <wp:inline distB="0" distT="0" distL="0" distR="0">
             <wp:extent cx="5619750" cy="3771900"/>
             <wp:effectExtent b="0" l="0" r="0" t="0"/>
-            <wp:docPr descr="Detalle del curso (curso-detalle.html)" id="12" name="image11.png"/>
+            <wp:docPr descr="Detalle del curso (curso-detalle.html)" id="12" name="image6.png"/>
             <a:graphic>
               <a:graphicData uri="http://schemas.openxmlformats.org/drawingml/2006/picture">
                 <pic:pic>
                   <pic:nvPicPr>
-                    <pic:cNvPr descr="Detalle del curso (curso-detalle.html)" id="0" name="image11.png"/>
+                    <pic:cNvPr descr="Detalle del curso (curso-detalle.html)" id="0" name="image6.png"/>
                     <pic:cNvPicPr preferRelativeResize="0"/>
                   </pic:nvPicPr>
                   <pic:blipFill>
@@ -6907,12 +6692,12 @@
           <wp:inline distB="0" distT="0" distL="0" distR="0">
             <wp:extent cx="5619750" cy="4248150"/>
             <wp:effectExtent b="0" l="0" r="0" t="0"/>
-            <wp:docPr descr="Bandeja de revisión (revision.html)" id="6" name="image7.png"/>
+            <wp:docPr descr="Bandeja de revisión (revision.html)" id="6" name="image11.png"/>
             <a:graphic>
               <a:graphicData uri="http://schemas.openxmlformats.org/drawingml/2006/picture">
                 <pic:pic>
                   <pic:nvPicPr>
-                    <pic:cNvPr descr="Bandeja de revisión (revision.html)" id="0" name="image7.png"/>
+                    <pic:cNvPr descr="Bandeja de revisión (revision.html)" id="0" name="image11.png"/>
                     <pic:cNvPicPr preferRelativeResize="0"/>
                   </pic:nvPicPr>
                   <pic:blipFill>
@@ -7027,12 +6812,12 @@
           <wp:inline distB="0" distT="0" distL="0" distR="0">
             <wp:extent cx="4476750" cy="4295775"/>
             <wp:effectExtent b="0" l="0" r="0" t="0"/>
-            <wp:docPr descr="Vista en dispositivo móvil (inicio.html y curso-formulario.html)" id="5" name="image3.png"/>
+            <wp:docPr descr="Vista en dispositivo móvil (inicio.html y curso-formulario.html)" id="5" name="image8.png"/>
             <a:graphic>
               <a:graphicData uri="http://schemas.openxmlformats.org/drawingml/2006/picture">
                 <pic:pic>
                   <pic:nvPicPr>
-                    <pic:cNvPr descr="Vista en dispositivo móvil (inicio.html y curso-formulario.html)" id="0" name="image3.png"/>
+                    <pic:cNvPr descr="Vista en dispositivo móvil (inicio.html y curso-formulario.html)" id="0" name="image8.png"/>
                     <pic:cNvPicPr preferRelativeResize="0"/>
                   </pic:nvPicPr>
                   <pic:blipFill>
@@ -26582,16 +26367,16 @@
         <w:tblLook w:val="0000"/>
       </w:tblPr>
       <w:tblGrid>
-        <w:gridCol w:w="1920"/>
-        <w:gridCol w:w="1365"/>
-        <w:gridCol w:w="2895"/>
-        <w:gridCol w:w="3195"/>
+        <w:gridCol w:w="2040"/>
+        <w:gridCol w:w="1485"/>
+        <w:gridCol w:w="2700"/>
+        <w:gridCol w:w="3150"/>
         <w:tblGridChange w:id="0">
           <w:tblGrid>
-            <w:gridCol w:w="1920"/>
-            <w:gridCol w:w="1365"/>
-            <w:gridCol w:w="2895"/>
-            <w:gridCol w:w="3195"/>
+            <w:gridCol w:w="2040"/>
+            <w:gridCol w:w="1485"/>
+            <w:gridCol w:w="2700"/>
+            <w:gridCol w:w="3150"/>
           </w:tblGrid>
         </w:tblGridChange>
       </w:tblGrid>
@@ -26785,7 +26570,6 @@
           <w:p>
             <w:pPr>
               <w:spacing w:after="20" w:line="240" w:lineRule="auto"/>
-              <w:jc w:val="both"/>
               <w:rPr/>
             </w:pPr>
             <w:r>
@@ -26815,7 +26599,6 @@
           <w:p>
             <w:pPr>
               <w:spacing w:after="20" w:line="240" w:lineRule="auto"/>
-              <w:jc w:val="both"/>
               <w:rPr/>
             </w:pPr>
             <w:r>
@@ -26845,7 +26628,6 @@
           <w:p>
             <w:pPr>
               <w:spacing w:after="20" w:line="240" w:lineRule="auto"/>
-              <w:jc w:val="both"/>
               <w:rPr/>
             </w:pPr>
             <w:r>
@@ -26875,7 +26657,6 @@
           <w:p>
             <w:pPr>
               <w:spacing w:after="20" w:line="240" w:lineRule="auto"/>
-              <w:jc w:val="both"/>
               <w:rPr/>
             </w:pPr>
             <w:r>
@@ -26911,14 +26692,13 @@
           <w:p>
             <w:pPr>
               <w:spacing w:after="20" w:line="240" w:lineRule="auto"/>
-              <w:jc w:val="both"/>
-              <w:rPr/>
-            </w:pPr>
-            <w:r>
-              <w:rPr>
-                <w:rtl w:val="0"/>
-              </w:rPr>
-              <w:t xml:space="preserve">contraseñaLogin </w:t>
+              <w:rPr/>
+            </w:pPr>
+            <w:r>
+              <w:rPr>
+                <w:rtl w:val="0"/>
+              </w:rPr>
+              <w:t xml:space="preserve">contrasenaLogin </w:t>
             </w:r>
           </w:p>
         </w:tc>
@@ -26939,7 +26719,6 @@
           <w:p>
             <w:pPr>
               <w:spacing w:after="20" w:line="240" w:lineRule="auto"/>
-              <w:jc w:val="both"/>
               <w:rPr/>
             </w:pPr>
             <w:r>
@@ -26967,7 +26746,6 @@
           <w:p>
             <w:pPr>
               <w:spacing w:after="20" w:line="240" w:lineRule="auto"/>
-              <w:jc w:val="both"/>
               <w:rPr/>
             </w:pPr>
             <w:r>
@@ -26997,7 +26775,6 @@
           <w:p>
             <w:pPr>
               <w:spacing w:after="20" w:line="240" w:lineRule="auto"/>
-              <w:jc w:val="both"/>
               <w:rPr/>
             </w:pPr>
             <w:r>
@@ -27033,7 +26810,6 @@
           <w:p>
             <w:pPr>
               <w:spacing w:after="20" w:line="240" w:lineRule="auto"/>
-              <w:jc w:val="both"/>
               <w:rPr/>
             </w:pPr>
             <w:r>
@@ -27061,7 +26837,6 @@
           <w:p>
             <w:pPr>
               <w:spacing w:after="20" w:line="240" w:lineRule="auto"/>
-              <w:jc w:val="both"/>
               <w:rPr/>
             </w:pPr>
             <w:r>
@@ -27089,7 +26864,6 @@
           <w:p>
             <w:pPr>
               <w:spacing w:after="20" w:line="240" w:lineRule="auto"/>
-              <w:jc w:val="both"/>
               <w:rPr/>
             </w:pPr>
             <w:r>
@@ -27119,7 +26893,6 @@
           <w:p>
             <w:pPr>
               <w:spacing w:after="20" w:line="240" w:lineRule="auto"/>
-              <w:jc w:val="both"/>
               <w:rPr/>
             </w:pPr>
             <w:r>
@@ -27155,7 +26928,6 @@
           <w:p>
             <w:pPr>
               <w:spacing w:after="20" w:line="240" w:lineRule="auto"/>
-              <w:jc w:val="both"/>
               <w:rPr/>
             </w:pPr>
             <w:r>
@@ -27185,7 +26957,6 @@
           <w:p>
             <w:pPr>
               <w:spacing w:after="20" w:line="240" w:lineRule="auto"/>
-              <w:jc w:val="both"/>
               <w:rPr/>
             </w:pPr>
             <w:r>
@@ -27215,7 +26986,6 @@
           <w:p>
             <w:pPr>
               <w:spacing w:after="20" w:line="240" w:lineRule="auto"/>
-              <w:jc w:val="both"/>
               <w:rPr/>
             </w:pPr>
             <w:r>
@@ -27245,7 +27015,6 @@
           <w:p>
             <w:pPr>
               <w:spacing w:after="20" w:line="240" w:lineRule="auto"/>
-              <w:jc w:val="both"/>
               <w:rPr/>
             </w:pPr>
             <w:r>
@@ -27281,7 +27050,6 @@
           <w:p>
             <w:pPr>
               <w:spacing w:after="20" w:line="240" w:lineRule="auto"/>
-              <w:jc w:val="both"/>
               <w:rPr/>
             </w:pPr>
             <w:r>
@@ -27311,7 +27079,6 @@
           <w:p>
             <w:pPr>
               <w:spacing w:after="20" w:line="240" w:lineRule="auto"/>
-              <w:jc w:val="both"/>
               <w:rPr/>
             </w:pPr>
             <w:r>
@@ -27341,7 +27108,6 @@
           <w:p>
             <w:pPr>
               <w:spacing w:after="20" w:line="240" w:lineRule="auto"/>
-              <w:jc w:val="both"/>
               <w:rPr/>
             </w:pPr>
             <w:r>
@@ -27371,7 +27137,6 @@
           <w:p>
             <w:pPr>
               <w:spacing w:after="20" w:line="240" w:lineRule="auto"/>
-              <w:jc w:val="both"/>
               <w:rPr/>
             </w:pPr>
             <w:r>
@@ -27407,7 +27172,6 @@
           <w:p>
             <w:pPr>
               <w:spacing w:after="20" w:line="240" w:lineRule="auto"/>
-              <w:jc w:val="both"/>
               <w:rPr/>
             </w:pPr>
             <w:r>
@@ -27437,7 +27201,6 @@
           <w:p>
             <w:pPr>
               <w:spacing w:after="20" w:line="240" w:lineRule="auto"/>
-              <w:jc w:val="both"/>
               <w:rPr/>
             </w:pPr>
             <w:r>
@@ -27467,7 +27230,6 @@
           <w:p>
             <w:pPr>
               <w:spacing w:after="20" w:line="240" w:lineRule="auto"/>
-              <w:jc w:val="both"/>
               <w:rPr/>
             </w:pPr>
             <w:r>
@@ -27497,7 +27259,6 @@
           <w:p>
             <w:pPr>
               <w:spacing w:after="20" w:line="240" w:lineRule="auto"/>
-              <w:jc w:val="both"/>
               <w:rPr/>
             </w:pPr>
             <w:r>
@@ -27533,7 +27294,6 @@
           <w:p>
             <w:pPr>
               <w:spacing w:after="20" w:line="240" w:lineRule="auto"/>
-              <w:jc w:val="both"/>
               <w:rPr/>
             </w:pPr>
             <w:r>
@@ -27563,7 +27323,6 @@
           <w:p>
             <w:pPr>
               <w:spacing w:after="20" w:line="240" w:lineRule="auto"/>
-              <w:jc w:val="both"/>
               <w:rPr/>
             </w:pPr>
             <w:r>
@@ -27593,7 +27352,6 @@
           <w:p>
             <w:pPr>
               <w:spacing w:after="20" w:line="240" w:lineRule="auto"/>
-              <w:jc w:val="both"/>
               <w:rPr/>
             </w:pPr>
             <w:r>
@@ -27623,7 +27381,6 @@
           <w:p>
             <w:pPr>
               <w:spacing w:after="20" w:line="240" w:lineRule="auto"/>
-              <w:jc w:val="both"/>
               <w:rPr/>
             </w:pPr>
             <w:r>
@@ -27659,7 +27416,6 @@
           <w:p>
             <w:pPr>
               <w:spacing w:after="20" w:line="240" w:lineRule="auto"/>
-              <w:jc w:val="both"/>
               <w:rPr/>
             </w:pPr>
             <w:r>
@@ -27689,7 +27445,6 @@
           <w:p>
             <w:pPr>
               <w:spacing w:after="20" w:line="240" w:lineRule="auto"/>
-              <w:jc w:val="both"/>
               <w:rPr/>
             </w:pPr>
             <w:r>
@@ -27719,7 +27474,6 @@
           <w:p>
             <w:pPr>
               <w:spacing w:after="20" w:line="240" w:lineRule="auto"/>
-              <w:jc w:val="both"/>
               <w:rPr/>
             </w:pPr>
             <w:r>
@@ -27749,7 +27503,6 @@
           <w:p>
             <w:pPr>
               <w:spacing w:after="20" w:line="240" w:lineRule="auto"/>
-              <w:jc w:val="both"/>
               <w:rPr/>
             </w:pPr>
             <w:r>
@@ -27785,7 +27538,6 @@
           <w:p>
             <w:pPr>
               <w:spacing w:after="20" w:line="240" w:lineRule="auto"/>
-              <w:jc w:val="both"/>
               <w:rPr/>
             </w:pPr>
             <w:r>
@@ -27815,7 +27567,6 @@
           <w:p>
             <w:pPr>
               <w:spacing w:after="20" w:line="240" w:lineRule="auto"/>
-              <w:jc w:val="both"/>
               <w:rPr/>
             </w:pPr>
             <w:r>
@@ -27845,7 +27596,6 @@
           <w:p>
             <w:pPr>
               <w:spacing w:after="20" w:line="240" w:lineRule="auto"/>
-              <w:jc w:val="both"/>
               <w:rPr/>
             </w:pPr>
             <w:r>
@@ -27875,7 +27625,6 @@
           <w:p>
             <w:pPr>
               <w:spacing w:after="20" w:line="240" w:lineRule="auto"/>
-              <w:jc w:val="both"/>
               <w:rPr/>
             </w:pPr>
             <w:r>
@@ -27911,7 +27660,6 @@
           <w:p>
             <w:pPr>
               <w:spacing w:after="20" w:line="240" w:lineRule="auto"/>
-              <w:jc w:val="both"/>
               <w:rPr/>
             </w:pPr>
             <w:r>
@@ -27941,7 +27689,6 @@
           <w:p>
             <w:pPr>
               <w:spacing w:after="20" w:line="240" w:lineRule="auto"/>
-              <w:jc w:val="both"/>
               <w:rPr/>
             </w:pPr>
             <w:r>
@@ -27971,7 +27718,6 @@
           <w:p>
             <w:pPr>
               <w:spacing w:after="20" w:line="240" w:lineRule="auto"/>
-              <w:jc w:val="both"/>
               <w:rPr/>
             </w:pPr>
             <w:r>
@@ -28001,7 +27747,6 @@
           <w:p>
             <w:pPr>
               <w:spacing w:after="20" w:line="240" w:lineRule="auto"/>
-              <w:jc w:val="both"/>
               <w:rPr/>
             </w:pPr>
             <w:r>
@@ -28037,7 +27782,6 @@
           <w:p>
             <w:pPr>
               <w:spacing w:after="20" w:line="240" w:lineRule="auto"/>
-              <w:jc w:val="both"/>
               <w:rPr/>
             </w:pPr>
             <w:r>
@@ -28067,7 +27811,6 @@
           <w:p>
             <w:pPr>
               <w:spacing w:after="20" w:line="240" w:lineRule="auto"/>
-              <w:jc w:val="both"/>
               <w:rPr/>
             </w:pPr>
             <w:r>
@@ -28097,7 +27840,6 @@
           <w:p>
             <w:pPr>
               <w:spacing w:after="20" w:line="240" w:lineRule="auto"/>
-              <w:jc w:val="both"/>
               <w:rPr/>
             </w:pPr>
             <w:r>
@@ -28127,7 +27869,6 @@
           <w:p>
             <w:pPr>
               <w:spacing w:after="20" w:line="240" w:lineRule="auto"/>
-              <w:jc w:val="both"/>
               <w:rPr/>
             </w:pPr>
             <w:r>
@@ -28163,37 +27904,35 @@
           <w:p>
             <w:pPr>
               <w:spacing w:after="20" w:line="240" w:lineRule="auto"/>
-              <w:jc w:val="both"/>
-              <w:rPr/>
-            </w:pPr>
-            <w:r>
-              <w:rPr>
-                <w:rtl w:val="0"/>
-              </w:rPr>
-              <w:t xml:space="preserve">contraseña </w:t>
-            </w:r>
-          </w:p>
-        </w:tc>
-        <w:tc>
-          <w:tcPr>
-            <w:tcBorders>
-              <w:top w:color="000000" w:space="0" w:sz="4" w:val="single"/>
-              <w:left w:color="000000" w:space="0" w:sz="4" w:val="single"/>
-              <w:bottom w:color="000000" w:space="0" w:sz="4" w:val="single"/>
-              <w:right w:color="000000" w:space="0" w:sz="4" w:val="single"/>
-            </w:tcBorders>
-            <w:tcMar>
-              <w:top w:w="60.0" w:type="dxa"/>
-              <w:left w:w="100.0" w:type="dxa"/>
-              <w:bottom w:w="60.0" w:type="dxa"/>
-              <w:right w:w="100.0" w:type="dxa"/>
-            </w:tcMar>
-            <w:vAlign w:val="top"/>
-          </w:tcPr>
-          <w:p>
-            <w:pPr>
-              <w:spacing w:after="20" w:line="240" w:lineRule="auto"/>
-              <w:jc w:val="both"/>
+              <w:rPr/>
+            </w:pPr>
+            <w:r>
+              <w:rPr>
+                <w:rtl w:val="0"/>
+              </w:rPr>
+              <w:t xml:space="preserve">contrasena </w:t>
+            </w:r>
+          </w:p>
+        </w:tc>
+        <w:tc>
+          <w:tcPr>
+            <w:tcBorders>
+              <w:top w:color="000000" w:space="0" w:sz="4" w:val="single"/>
+              <w:left w:color="000000" w:space="0" w:sz="4" w:val="single"/>
+              <w:bottom w:color="000000" w:space="0" w:sz="4" w:val="single"/>
+              <w:right w:color="000000" w:space="0" w:sz="4" w:val="single"/>
+            </w:tcBorders>
+            <w:tcMar>
+              <w:top w:w="60.0" w:type="dxa"/>
+              <w:left w:w="100.0" w:type="dxa"/>
+              <w:bottom w:w="60.0" w:type="dxa"/>
+              <w:right w:w="100.0" w:type="dxa"/>
+            </w:tcMar>
+            <w:vAlign w:val="top"/>
+          </w:tcPr>
+          <w:p>
+            <w:pPr>
+              <w:spacing w:after="20" w:line="240" w:lineRule="auto"/>
               <w:rPr/>
             </w:pPr>
             <w:r>
@@ -28222,7 +27961,6 @@
           <w:p>
             <w:pPr>
               <w:spacing w:after="20" w:line="240" w:lineRule="auto"/>
-              <w:jc w:val="both"/>
               <w:rPr/>
             </w:pPr>
             <w:r>
@@ -28250,7 +27988,6 @@
           <w:p>
             <w:pPr>
               <w:spacing w:after="20" w:line="240" w:lineRule="auto"/>
-              <w:jc w:val="both"/>
               <w:rPr/>
             </w:pPr>
             <w:r>
@@ -28286,7 +28023,6 @@
           <w:p>
             <w:pPr>
               <w:spacing w:after="20" w:line="240" w:lineRule="auto"/>
-              <w:jc w:val="both"/>
               <w:rPr/>
             </w:pPr>
             <w:r>
@@ -28316,7 +28052,6 @@
           <w:p>
             <w:pPr>
               <w:spacing w:after="20" w:line="240" w:lineRule="auto"/>
-              <w:jc w:val="both"/>
               <w:rPr/>
             </w:pPr>
             <w:r>
@@ -28346,7 +28081,6 @@
           <w:p>
             <w:pPr>
               <w:spacing w:after="20" w:line="240" w:lineRule="auto"/>
-              <w:jc w:val="both"/>
               <w:rPr/>
             </w:pPr>
             <w:r>
@@ -28376,7 +28110,6 @@
           <w:p>
             <w:pPr>
               <w:spacing w:after="20" w:line="240" w:lineRule="auto"/>
-              <w:jc w:val="both"/>
               <w:rPr/>
             </w:pPr>
             <w:r>
@@ -28412,7 +28145,6 @@
           <w:p>
             <w:pPr>
               <w:spacing w:after="20" w:line="240" w:lineRule="auto"/>
-              <w:jc w:val="both"/>
               <w:rPr/>
             </w:pPr>
             <w:r>
@@ -28442,7 +28174,6 @@
           <w:p>
             <w:pPr>
               <w:spacing w:after="20" w:line="240" w:lineRule="auto"/>
-              <w:jc w:val="both"/>
               <w:rPr/>
             </w:pPr>
             <w:r>
@@ -28472,7 +28203,6 @@
           <w:p>
             <w:pPr>
               <w:spacing w:after="20" w:line="240" w:lineRule="auto"/>
-              <w:jc w:val="both"/>
               <w:rPr/>
             </w:pPr>
             <w:r>
@@ -28502,7 +28232,6 @@
           <w:p>
             <w:pPr>
               <w:spacing w:after="20" w:line="240" w:lineRule="auto"/>
-              <w:jc w:val="both"/>
               <w:rPr/>
             </w:pPr>
             <w:r>
@@ -28538,7 +28267,6 @@
           <w:p>
             <w:pPr>
               <w:spacing w:after="20" w:line="240" w:lineRule="auto"/>
-              <w:jc w:val="both"/>
               <w:rPr/>
             </w:pPr>
             <w:r>
@@ -28568,7 +28296,6 @@
           <w:p>
             <w:pPr>
               <w:spacing w:after="20" w:line="240" w:lineRule="auto"/>
-              <w:jc w:val="both"/>
               <w:rPr/>
             </w:pPr>
             <w:r>
@@ -28598,7 +28325,6 @@
           <w:p>
             <w:pPr>
               <w:spacing w:after="20" w:line="240" w:lineRule="auto"/>
-              <w:jc w:val="both"/>
               <w:rPr/>
             </w:pPr>
             <w:r>
@@ -28628,7 +28354,6 @@
           <w:p>
             <w:pPr>
               <w:spacing w:after="20" w:line="240" w:lineRule="auto"/>
-              <w:jc w:val="both"/>
               <w:rPr/>
             </w:pPr>
             <w:r>
@@ -28664,7 +28389,6 @@
           <w:p>
             <w:pPr>
               <w:spacing w:after="20" w:line="240" w:lineRule="auto"/>
-              <w:jc w:val="both"/>
               <w:rPr/>
             </w:pPr>
             <w:r>
@@ -28694,7 +28418,6 @@
           <w:p>
             <w:pPr>
               <w:spacing w:after="20" w:line="240" w:lineRule="auto"/>
-              <w:jc w:val="both"/>
               <w:rPr/>
             </w:pPr>
             <w:r>
@@ -28724,7 +28447,6 @@
           <w:p>
             <w:pPr>
               <w:spacing w:after="20" w:line="240" w:lineRule="auto"/>
-              <w:jc w:val="both"/>
               <w:rPr/>
             </w:pPr>
             <w:r>
@@ -28754,7 +28476,6 @@
           <w:p>
             <w:pPr>
               <w:spacing w:after="20" w:line="240" w:lineRule="auto"/>
-              <w:jc w:val="both"/>
               <w:rPr/>
             </w:pPr>
             <w:r>
@@ -28790,7 +28511,6 @@
           <w:p>
             <w:pPr>
               <w:spacing w:after="20" w:line="240" w:lineRule="auto"/>
-              <w:jc w:val="both"/>
               <w:rPr/>
             </w:pPr>
             <w:r>
@@ -28820,7 +28540,6 @@
           <w:p>
             <w:pPr>
               <w:spacing w:after="20" w:line="240" w:lineRule="auto"/>
-              <w:jc w:val="both"/>
               <w:rPr/>
             </w:pPr>
             <w:r>
@@ -28850,7 +28569,6 @@
           <w:p>
             <w:pPr>
               <w:spacing w:after="20" w:line="240" w:lineRule="auto"/>
-              <w:jc w:val="both"/>
               <w:rPr/>
             </w:pPr>
             <w:r>
@@ -28880,7 +28598,6 @@
           <w:p>
             <w:pPr>
               <w:spacing w:after="20" w:line="240" w:lineRule="auto"/>
-              <w:jc w:val="both"/>
               <w:rPr/>
             </w:pPr>
             <w:r>
@@ -28916,7 +28633,6 @@
           <w:p>
             <w:pPr>
               <w:spacing w:after="20" w:line="240" w:lineRule="auto"/>
-              <w:jc w:val="both"/>
               <w:rPr/>
             </w:pPr>
             <w:r>
@@ -28946,7 +28662,6 @@
           <w:p>
             <w:pPr>
               <w:spacing w:after="20" w:line="240" w:lineRule="auto"/>
-              <w:jc w:val="both"/>
               <w:rPr/>
             </w:pPr>
             <w:r>
@@ -28976,7 +28691,6 @@
           <w:p>
             <w:pPr>
               <w:spacing w:after="20" w:line="240" w:lineRule="auto"/>
-              <w:jc w:val="both"/>
               <w:rPr/>
             </w:pPr>
             <w:r>
@@ -29006,7 +28720,6 @@
           <w:p>
             <w:pPr>
               <w:spacing w:after="20" w:line="240" w:lineRule="auto"/>
-              <w:jc w:val="both"/>
               <w:rPr/>
             </w:pPr>
             <w:r>
@@ -29042,7 +28755,6 @@
           <w:p>
             <w:pPr>
               <w:spacing w:after="20" w:line="240" w:lineRule="auto"/>
-              <w:jc w:val="both"/>
               <w:rPr/>
             </w:pPr>
             <w:r>
@@ -29072,7 +28784,6 @@
           <w:p>
             <w:pPr>
               <w:spacing w:after="20" w:line="240" w:lineRule="auto"/>
-              <w:jc w:val="both"/>
               <w:rPr/>
             </w:pPr>
             <w:r>
@@ -29102,7 +28813,6 @@
           <w:p>
             <w:pPr>
               <w:spacing w:after="20" w:line="240" w:lineRule="auto"/>
-              <w:jc w:val="both"/>
               <w:rPr/>
             </w:pPr>
             <w:r>
@@ -29132,7 +28842,6 @@
           <w:p>
             <w:pPr>
               <w:spacing w:after="20" w:line="240" w:lineRule="auto"/>
-              <w:jc w:val="both"/>
               <w:rPr/>
             </w:pPr>
             <w:r>
@@ -29168,7 +28877,6 @@
           <w:p>
             <w:pPr>
               <w:spacing w:after="20" w:line="240" w:lineRule="auto"/>
-              <w:jc w:val="both"/>
               <w:rPr/>
             </w:pPr>
             <w:r>
@@ -29198,7 +28906,6 @@
           <w:p>
             <w:pPr>
               <w:spacing w:after="20" w:line="240" w:lineRule="auto"/>
-              <w:jc w:val="both"/>
               <w:rPr/>
             </w:pPr>
             <w:r>
@@ -29228,7 +28935,6 @@
           <w:p>
             <w:pPr>
               <w:spacing w:after="20" w:line="240" w:lineRule="auto"/>
-              <w:jc w:val="both"/>
               <w:rPr/>
             </w:pPr>
             <w:r>
@@ -29258,7 +28964,6 @@
           <w:p>
             <w:pPr>
               <w:spacing w:after="20" w:line="240" w:lineRule="auto"/>
-              <w:jc w:val="both"/>
               <w:rPr/>
             </w:pPr>
             <w:r>
@@ -29294,7 +28999,6 @@
           <w:p>
             <w:pPr>
               <w:spacing w:after="20" w:line="240" w:lineRule="auto"/>
-              <w:jc w:val="both"/>
               <w:rPr/>
             </w:pPr>
             <w:r>
@@ -29324,7 +29028,6 @@
           <w:p>
             <w:pPr>
               <w:spacing w:after="20" w:line="240" w:lineRule="auto"/>
-              <w:jc w:val="both"/>
               <w:rPr/>
             </w:pPr>
             <w:r>
@@ -29354,7 +29057,6 @@
           <w:p>
             <w:pPr>
               <w:spacing w:after="20" w:line="240" w:lineRule="auto"/>
-              <w:jc w:val="both"/>
               <w:rPr/>
             </w:pPr>
             <w:r>
@@ -29384,7 +29086,6 @@
           <w:p>
             <w:pPr>
               <w:spacing w:after="20" w:line="240" w:lineRule="auto"/>
-              <w:jc w:val="both"/>
               <w:rPr/>
             </w:pPr>
             <w:r>
@@ -29420,7 +29121,6 @@
           <w:p>
             <w:pPr>
               <w:spacing w:after="20" w:line="240" w:lineRule="auto"/>
-              <w:jc w:val="both"/>
               <w:rPr/>
             </w:pPr>
             <w:r>
@@ -29450,7 +29150,6 @@
           <w:p>
             <w:pPr>
               <w:spacing w:after="20" w:line="240" w:lineRule="auto"/>
-              <w:jc w:val="both"/>
               <w:rPr/>
             </w:pPr>
             <w:r>
@@ -29480,7 +29179,6 @@
           <w:p>
             <w:pPr>
               <w:spacing w:after="20" w:line="240" w:lineRule="auto"/>
-              <w:jc w:val="both"/>
               <w:rPr/>
             </w:pPr>
             <w:r>
@@ -29510,7 +29208,6 @@
           <w:p>
             <w:pPr>
               <w:spacing w:after="20" w:line="240" w:lineRule="auto"/>
-              <w:jc w:val="both"/>
               <w:rPr/>
             </w:pPr>
             <w:r>
@@ -29546,7 +29243,6 @@
           <w:p>
             <w:pPr>
               <w:spacing w:after="20" w:line="240" w:lineRule="auto"/>
-              <w:jc w:val="both"/>
               <w:rPr/>
             </w:pPr>
             <w:r>
@@ -29576,7 +29272,6 @@
           <w:p>
             <w:pPr>
               <w:spacing w:after="20" w:line="240" w:lineRule="auto"/>
-              <w:jc w:val="both"/>
               <w:rPr/>
             </w:pPr>
             <w:r>
@@ -29606,7 +29301,6 @@
           <w:p>
             <w:pPr>
               <w:spacing w:after="20" w:line="240" w:lineRule="auto"/>
-              <w:jc w:val="both"/>
               <w:rPr/>
             </w:pPr>
             <w:r>
@@ -29636,7 +29330,6 @@
           <w:p>
             <w:pPr>
               <w:spacing w:after="20" w:line="240" w:lineRule="auto"/>
-              <w:jc w:val="both"/>
               <w:rPr/>
             </w:pPr>
             <w:r>
@@ -29672,7 +29365,6 @@
           <w:p>
             <w:pPr>
               <w:spacing w:after="20" w:line="240" w:lineRule="auto"/>
-              <w:jc w:val="both"/>
               <w:rPr/>
             </w:pPr>
             <w:r>
@@ -29702,7 +29394,6 @@
           <w:p>
             <w:pPr>
               <w:spacing w:after="20" w:line="240" w:lineRule="auto"/>
-              <w:jc w:val="both"/>
               <w:rPr/>
             </w:pPr>
             <w:r>
@@ -29732,37 +29423,35 @@
           <w:p>
             <w:pPr>
               <w:spacing w:after="20" w:line="240" w:lineRule="auto"/>
-              <w:jc w:val="both"/>
-              <w:rPr/>
-            </w:pPr>
-            <w:r>
-              <w:rPr>
-                <w:rtl w:val="0"/>
-              </w:rPr>
-              <w:t xml:space="preserve">No Vacio</w:t>
-            </w:r>
-          </w:p>
-        </w:tc>
-        <w:tc>
-          <w:tcPr>
-            <w:tcBorders>
-              <w:top w:color="000000" w:space="0" w:sz="4" w:val="single"/>
-              <w:left w:color="000000" w:space="0" w:sz="4" w:val="single"/>
-              <w:bottom w:color="000000" w:space="0" w:sz="4" w:val="single"/>
-              <w:right w:color="000000" w:space="0" w:sz="4" w:val="single"/>
-            </w:tcBorders>
-            <w:tcMar>
-              <w:top w:w="60.0" w:type="dxa"/>
-              <w:left w:w="100.0" w:type="dxa"/>
-              <w:bottom w:w="60.0" w:type="dxa"/>
-              <w:right w:w="100.0" w:type="dxa"/>
-            </w:tcMar>
-            <w:vAlign w:val="top"/>
-          </w:tcPr>
-          <w:p>
-            <w:pPr>
-              <w:spacing w:after="20" w:line="240" w:lineRule="auto"/>
-              <w:jc w:val="both"/>
+              <w:rPr/>
+            </w:pPr>
+            <w:r>
+              <w:rPr>
+                <w:rtl w:val="0"/>
+              </w:rPr>
+              <w:t xml:space="preserve">No vacío</w:t>
+            </w:r>
+          </w:p>
+        </w:tc>
+        <w:tc>
+          <w:tcPr>
+            <w:tcBorders>
+              <w:top w:color="000000" w:space="0" w:sz="4" w:val="single"/>
+              <w:left w:color="000000" w:space="0" w:sz="4" w:val="single"/>
+              <w:bottom w:color="000000" w:space="0" w:sz="4" w:val="single"/>
+              <w:right w:color="000000" w:space="0" w:sz="4" w:val="single"/>
+            </w:tcBorders>
+            <w:tcMar>
+              <w:top w:w="60.0" w:type="dxa"/>
+              <w:left w:w="100.0" w:type="dxa"/>
+              <w:bottom w:w="60.0" w:type="dxa"/>
+              <w:right w:w="100.0" w:type="dxa"/>
+            </w:tcMar>
+            <w:vAlign w:val="top"/>
+          </w:tcPr>
+          <w:p>
+            <w:pPr>
+              <w:spacing w:after="20" w:line="240" w:lineRule="auto"/>
               <w:rPr/>
             </w:pPr>
             <w:r>
@@ -29770,6 +29459,250 @@
                 <w:rtl w:val="0"/>
               </w:rPr>
               <w:t xml:space="preserve">El código es obligatorio. </w:t>
+            </w:r>
+          </w:p>
+        </w:tc>
+      </w:tr>
+      <w:tr>
+        <w:trPr>
+          <w:cantSplit w:val="1"/>
+          <w:tblHeader w:val="0"/>
+        </w:trPr>
+        <w:tc>
+          <w:tcPr>
+            <w:tcBorders>
+              <w:top w:color="000000" w:space="0" w:sz="4" w:val="single"/>
+              <w:left w:color="000000" w:space="0" w:sz="4" w:val="single"/>
+              <w:bottom w:color="000000" w:space="0" w:sz="4" w:val="single"/>
+              <w:right w:color="000000" w:space="0" w:sz="4" w:val="single"/>
+            </w:tcBorders>
+            <w:tcMar>
+              <w:top w:w="60.0" w:type="dxa"/>
+              <w:left w:w="100.0" w:type="dxa"/>
+              <w:bottom w:w="60.0" w:type="dxa"/>
+              <w:right w:w="100.0" w:type="dxa"/>
+            </w:tcMar>
+            <w:vAlign w:val="top"/>
+          </w:tcPr>
+          <w:p>
+            <w:pPr>
+              <w:spacing w:after="20" w:line="240" w:lineRule="auto"/>
+              <w:rPr/>
+            </w:pPr>
+            <w:r>
+              <w:rPr>
+                <w:rtl w:val="0"/>
+              </w:rPr>
+              <w:t xml:space="preserve">escuela</w:t>
+            </w:r>
+          </w:p>
+        </w:tc>
+        <w:tc>
+          <w:tcPr>
+            <w:tcBorders>
+              <w:top w:color="000000" w:space="0" w:sz="4" w:val="single"/>
+              <w:left w:color="000000" w:space="0" w:sz="4" w:val="single"/>
+              <w:bottom w:color="000000" w:space="0" w:sz="4" w:val="single"/>
+              <w:right w:color="000000" w:space="0" w:sz="4" w:val="single"/>
+            </w:tcBorders>
+            <w:tcMar>
+              <w:top w:w="60.0" w:type="dxa"/>
+              <w:left w:w="100.0" w:type="dxa"/>
+              <w:bottom w:w="60.0" w:type="dxa"/>
+              <w:right w:w="100.0" w:type="dxa"/>
+            </w:tcMar>
+            <w:vAlign w:val="top"/>
+          </w:tcPr>
+          <w:p>
+            <w:pPr>
+              <w:spacing w:after="20" w:line="240" w:lineRule="auto"/>
+              <w:rPr/>
+            </w:pPr>
+            <w:r>
+              <w:rPr>
+                <w:rtl w:val="0"/>
+              </w:rPr>
+              <w:t xml:space="preserve">lista</w:t>
+            </w:r>
+          </w:p>
+        </w:tc>
+        <w:tc>
+          <w:tcPr>
+            <w:tcBorders>
+              <w:top w:color="000000" w:space="0" w:sz="4" w:val="single"/>
+              <w:left w:color="000000" w:space="0" w:sz="4" w:val="single"/>
+              <w:bottom w:color="000000" w:space="0" w:sz="4" w:val="single"/>
+              <w:right w:color="000000" w:space="0" w:sz="4" w:val="single"/>
+            </w:tcBorders>
+            <w:tcMar>
+              <w:top w:w="60.0" w:type="dxa"/>
+              <w:left w:w="100.0" w:type="dxa"/>
+              <w:bottom w:w="60.0" w:type="dxa"/>
+              <w:right w:w="100.0" w:type="dxa"/>
+            </w:tcMar>
+            <w:vAlign w:val="top"/>
+          </w:tcPr>
+          <w:p>
+            <w:pPr>
+              <w:spacing w:after="20" w:line="240" w:lineRule="auto"/>
+              <w:rPr/>
+            </w:pPr>
+            <w:r>
+              <w:rPr>
+                <w:rtl w:val="0"/>
+              </w:rPr>
+              <w:t xml:space="preserve">Debe elegir la opción</w:t>
+            </w:r>
+          </w:p>
+        </w:tc>
+        <w:tc>
+          <w:tcPr>
+            <w:tcBorders>
+              <w:top w:color="000000" w:space="0" w:sz="4" w:val="single"/>
+              <w:left w:color="000000" w:space="0" w:sz="4" w:val="single"/>
+              <w:bottom w:color="000000" w:space="0" w:sz="4" w:val="single"/>
+              <w:right w:color="000000" w:space="0" w:sz="4" w:val="single"/>
+            </w:tcBorders>
+            <w:tcMar>
+              <w:top w:w="60.0" w:type="dxa"/>
+              <w:left w:w="100.0" w:type="dxa"/>
+              <w:bottom w:w="60.0" w:type="dxa"/>
+              <w:right w:w="100.0" w:type="dxa"/>
+            </w:tcMar>
+            <w:vAlign w:val="top"/>
+          </w:tcPr>
+          <w:p>
+            <w:pPr>
+              <w:spacing w:after="20" w:line="240" w:lineRule="auto"/>
+              <w:rPr/>
+            </w:pPr>
+            <w:r>
+              <w:rPr>
+                <w:rtl w:val="0"/>
+              </w:rPr>
+              <w:t xml:space="preserve">Seleccioná una escuela.</w:t>
+            </w:r>
+          </w:p>
+        </w:tc>
+      </w:tr>
+      <w:tr>
+        <w:trPr>
+          <w:cantSplit w:val="1"/>
+          <w:tblHeader w:val="0"/>
+        </w:trPr>
+        <w:tc>
+          <w:tcPr>
+            <w:tcBorders>
+              <w:top w:color="000000" w:space="0" w:sz="4" w:val="single"/>
+              <w:left w:color="000000" w:space="0" w:sz="4" w:val="single"/>
+              <w:bottom w:color="000000" w:space="0" w:sz="4" w:val="single"/>
+              <w:right w:color="000000" w:space="0" w:sz="4" w:val="single"/>
+            </w:tcBorders>
+            <w:tcMar>
+              <w:top w:w="60.0" w:type="dxa"/>
+              <w:left w:w="100.0" w:type="dxa"/>
+              <w:bottom w:w="60.0" w:type="dxa"/>
+              <w:right w:w="100.0" w:type="dxa"/>
+            </w:tcMar>
+            <w:vAlign w:val="top"/>
+          </w:tcPr>
+          <w:p>
+            <w:pPr>
+              <w:spacing w:after="20" w:line="240" w:lineRule="auto"/>
+              <w:rPr/>
+            </w:pPr>
+            <w:r>
+              <w:rPr>
+                <w:rtl w:val="0"/>
+              </w:rPr>
+              <w:t xml:space="preserve">codigo</w:t>
+            </w:r>
+          </w:p>
+        </w:tc>
+        <w:tc>
+          <w:tcPr>
+            <w:tcBorders>
+              <w:top w:color="000000" w:space="0" w:sz="4" w:val="single"/>
+              <w:left w:color="000000" w:space="0" w:sz="4" w:val="single"/>
+              <w:bottom w:color="000000" w:space="0" w:sz="4" w:val="single"/>
+              <w:right w:color="000000" w:space="0" w:sz="4" w:val="single"/>
+            </w:tcBorders>
+            <w:tcMar>
+              <w:top w:w="60.0" w:type="dxa"/>
+              <w:left w:w="100.0" w:type="dxa"/>
+              <w:bottom w:w="60.0" w:type="dxa"/>
+              <w:right w:w="100.0" w:type="dxa"/>
+            </w:tcMar>
+            <w:vAlign w:val="top"/>
+          </w:tcPr>
+          <w:p>
+            <w:pPr>
+              <w:spacing w:after="20" w:line="240" w:lineRule="auto"/>
+              <w:rPr/>
+            </w:pPr>
+            <w:r>
+              <w:rPr>
+                <w:rtl w:val="0"/>
+              </w:rPr>
+              <w:t xml:space="preserve">texto</w:t>
+            </w:r>
+          </w:p>
+        </w:tc>
+        <w:tc>
+          <w:tcPr>
+            <w:tcBorders>
+              <w:top w:color="000000" w:space="0" w:sz="4" w:val="single"/>
+              <w:left w:color="000000" w:space="0" w:sz="4" w:val="single"/>
+              <w:bottom w:color="000000" w:space="0" w:sz="4" w:val="single"/>
+              <w:right w:color="000000" w:space="0" w:sz="4" w:val="single"/>
+            </w:tcBorders>
+            <w:tcMar>
+              <w:top w:w="60.0" w:type="dxa"/>
+              <w:left w:w="100.0" w:type="dxa"/>
+              <w:bottom w:w="60.0" w:type="dxa"/>
+              <w:right w:w="100.0" w:type="dxa"/>
+            </w:tcMar>
+            <w:vAlign w:val="top"/>
+          </w:tcPr>
+          <w:p>
+            <w:pPr>
+              <w:spacing w:after="20" w:line="240" w:lineRule="auto"/>
+              <w:rPr/>
+            </w:pPr>
+            <w:r>
+              <w:rPr>
+                <w:rtl w:val="0"/>
+              </w:rPr>
+              <w:t xml:space="preserve">Obligatorio, salvo que codigoDc esté marcada</w:t>
+            </w:r>
+          </w:p>
+        </w:tc>
+        <w:tc>
+          <w:tcPr>
+            <w:tcBorders>
+              <w:top w:color="000000" w:space="0" w:sz="4" w:val="single"/>
+              <w:left w:color="000000" w:space="0" w:sz="4" w:val="single"/>
+              <w:bottom w:color="000000" w:space="0" w:sz="4" w:val="single"/>
+              <w:right w:color="000000" w:space="0" w:sz="4" w:val="single"/>
+            </w:tcBorders>
+            <w:tcMar>
+              <w:top w:w="60.0" w:type="dxa"/>
+              <w:left w:w="100.0" w:type="dxa"/>
+              <w:bottom w:w="60.0" w:type="dxa"/>
+              <w:right w:w="100.0" w:type="dxa"/>
+            </w:tcMar>
+            <w:vAlign w:val="top"/>
+          </w:tcPr>
+          <w:p>
+            <w:pPr>
+              <w:spacing w:after="20" w:line="240" w:lineRule="auto"/>
+              <w:rPr/>
+            </w:pPr>
+            <w:r>
+              <w:rPr>
+                <w:rtl w:val="0"/>
+              </w:rPr>
+              <w:t xml:space="preserve">El código es obligatorio.</w:t>
             </w:r>
           </w:p>
         </w:tc>
@@ -30164,64 +30097,67 @@
               <w:rPr>
                 <w:rtl w:val="0"/>
               </w:rPr>
-            </w:r>
-          </w:p>
-        </w:tc>
-        <w:tc>
-          <w:tcPr>
-            <w:tcBorders>
-              <w:top w:color="000000" w:space="0" w:sz="4" w:val="single"/>
-              <w:left w:color="000000" w:space="0" w:sz="4" w:val="single"/>
-              <w:bottom w:color="000000" w:space="0" w:sz="4" w:val="single"/>
-              <w:right w:color="000000" w:space="0" w:sz="4" w:val="single"/>
-            </w:tcBorders>
-            <w:tcMar>
-              <w:top w:w="60.0" w:type="dxa"/>
-              <w:left w:w="100.0" w:type="dxa"/>
-              <w:bottom w:w="60.0" w:type="dxa"/>
-              <w:right w:w="100.0" w:type="dxa"/>
-            </w:tcMar>
-            <w:vAlign w:val="top"/>
-          </w:tcPr>
-          <w:p>
-            <w:pPr>
-              <w:spacing w:after="20" w:line="240" w:lineRule="auto"/>
-              <w:jc w:val="both"/>
-              <w:rPr/>
-            </w:pPr>
-            <w:r>
-              <w:rPr>
-                <w:rtl w:val="0"/>
-              </w:rPr>
-            </w:r>
-          </w:p>
-        </w:tc>
-        <w:tc>
-          <w:tcPr>
-            <w:tcBorders>
-              <w:top w:color="000000" w:space="0" w:sz="4" w:val="single"/>
-              <w:left w:color="000000" w:space="0" w:sz="4" w:val="single"/>
-              <w:bottom w:color="000000" w:space="0" w:sz="4" w:val="single"/>
-              <w:right w:color="000000" w:space="0" w:sz="4" w:val="single"/>
-            </w:tcBorders>
-            <w:tcMar>
-              <w:top w:w="60.0" w:type="dxa"/>
-              <w:left w:w="100.0" w:type="dxa"/>
-              <w:bottom w:w="60.0" w:type="dxa"/>
-              <w:right w:w="100.0" w:type="dxa"/>
-            </w:tcMar>
-            <w:vAlign w:val="top"/>
-          </w:tcPr>
-          <w:p>
-            <w:pPr>
-              <w:spacing w:after="20" w:line="240" w:lineRule="auto"/>
-              <w:jc w:val="both"/>
-              <w:rPr/>
-            </w:pPr>
-            <w:r>
-              <w:rPr>
-                <w:rtl w:val="0"/>
-              </w:rPr>
+              <w:t xml:space="preserve">Enviar formLogin con correoLogin vacío </w:t>
+            </w:r>
+          </w:p>
+        </w:tc>
+        <w:tc>
+          <w:tcPr>
+            <w:tcBorders>
+              <w:top w:color="000000" w:space="0" w:sz="4" w:val="single"/>
+              <w:left w:color="000000" w:space="0" w:sz="4" w:val="single"/>
+              <w:bottom w:color="000000" w:space="0" w:sz="4" w:val="single"/>
+              <w:right w:color="000000" w:space="0" w:sz="4" w:val="single"/>
+            </w:tcBorders>
+            <w:tcMar>
+              <w:top w:w="60.0" w:type="dxa"/>
+              <w:left w:w="100.0" w:type="dxa"/>
+              <w:bottom w:w="60.0" w:type="dxa"/>
+              <w:right w:w="100.0" w:type="dxa"/>
+            </w:tcMar>
+            <w:vAlign w:val="top"/>
+          </w:tcPr>
+          <w:p>
+            <w:pPr>
+              <w:spacing w:after="20" w:line="240" w:lineRule="auto"/>
+              <w:jc w:val="both"/>
+              <w:rPr/>
+            </w:pPr>
+            <w:r>
+              <w:rPr>
+                <w:rtl w:val="0"/>
+              </w:rPr>
+              <w:t xml:space="preserve">Muestra "Ingresá un correo válido." y bloquea el envío </w:t>
+            </w:r>
+          </w:p>
+        </w:tc>
+        <w:tc>
+          <w:tcPr>
+            <w:tcBorders>
+              <w:top w:color="000000" w:space="0" w:sz="4" w:val="single"/>
+              <w:left w:color="000000" w:space="0" w:sz="4" w:val="single"/>
+              <w:bottom w:color="000000" w:space="0" w:sz="4" w:val="single"/>
+              <w:right w:color="000000" w:space="0" w:sz="4" w:val="single"/>
+            </w:tcBorders>
+            <w:tcMar>
+              <w:top w:w="60.0" w:type="dxa"/>
+              <w:left w:w="100.0" w:type="dxa"/>
+              <w:bottom w:w="60.0" w:type="dxa"/>
+              <w:right w:w="100.0" w:type="dxa"/>
+            </w:tcMar>
+            <w:vAlign w:val="top"/>
+          </w:tcPr>
+          <w:p>
+            <w:pPr>
+              <w:spacing w:after="20" w:line="240" w:lineRule="auto"/>
+              <w:jc w:val="both"/>
+              <w:rPr/>
+            </w:pPr>
+            <w:r>
+              <w:rPr>
+                <w:rtl w:val="0"/>
+              </w:rPr>
+              <w:t xml:space="preserve">Pendiente </w:t>
             </w:r>
           </w:p>
         </w:tc>
@@ -30294,64 +30230,67 @@
               <w:rPr>
                 <w:rtl w:val="0"/>
               </w:rPr>
-            </w:r>
-          </w:p>
-        </w:tc>
-        <w:tc>
-          <w:tcPr>
-            <w:tcBorders>
-              <w:top w:color="000000" w:space="0" w:sz="4" w:val="single"/>
-              <w:left w:color="000000" w:space="0" w:sz="4" w:val="single"/>
-              <w:bottom w:color="000000" w:space="0" w:sz="4" w:val="single"/>
-              <w:right w:color="000000" w:space="0" w:sz="4" w:val="single"/>
-            </w:tcBorders>
-            <w:tcMar>
-              <w:top w:w="60.0" w:type="dxa"/>
-              <w:left w:w="100.0" w:type="dxa"/>
-              <w:bottom w:w="60.0" w:type="dxa"/>
-              <w:right w:w="100.0" w:type="dxa"/>
-            </w:tcMar>
-            <w:vAlign w:val="top"/>
-          </w:tcPr>
-          <w:p>
-            <w:pPr>
-              <w:spacing w:after="20" w:line="240" w:lineRule="auto"/>
-              <w:jc w:val="both"/>
-              <w:rPr/>
-            </w:pPr>
-            <w:r>
-              <w:rPr>
-                <w:rtl w:val="0"/>
-              </w:rPr>
-            </w:r>
-          </w:p>
-        </w:tc>
-        <w:tc>
-          <w:tcPr>
-            <w:tcBorders>
-              <w:top w:color="000000" w:space="0" w:sz="4" w:val="single"/>
-              <w:left w:color="000000" w:space="0" w:sz="4" w:val="single"/>
-              <w:bottom w:color="000000" w:space="0" w:sz="4" w:val="single"/>
-              <w:right w:color="000000" w:space="0" w:sz="4" w:val="single"/>
-            </w:tcBorders>
-            <w:tcMar>
-              <w:top w:w="60.0" w:type="dxa"/>
-              <w:left w:w="100.0" w:type="dxa"/>
-              <w:bottom w:w="60.0" w:type="dxa"/>
-              <w:right w:w="100.0" w:type="dxa"/>
-            </w:tcMar>
-            <w:vAlign w:val="top"/>
-          </w:tcPr>
-          <w:p>
-            <w:pPr>
-              <w:spacing w:after="20" w:line="240" w:lineRule="auto"/>
-              <w:jc w:val="both"/>
-              <w:rPr/>
-            </w:pPr>
-            <w:r>
-              <w:rPr>
-                <w:rtl w:val="0"/>
-              </w:rPr>
+              <w:t xml:space="preserve">Ingresar celular con 7 dígitos en formUsuario </w:t>
+            </w:r>
+          </w:p>
+        </w:tc>
+        <w:tc>
+          <w:tcPr>
+            <w:tcBorders>
+              <w:top w:color="000000" w:space="0" w:sz="4" w:val="single"/>
+              <w:left w:color="000000" w:space="0" w:sz="4" w:val="single"/>
+              <w:bottom w:color="000000" w:space="0" w:sz="4" w:val="single"/>
+              <w:right w:color="000000" w:space="0" w:sz="4" w:val="single"/>
+            </w:tcBorders>
+            <w:tcMar>
+              <w:top w:w="60.0" w:type="dxa"/>
+              <w:left w:w="100.0" w:type="dxa"/>
+              <w:bottom w:w="60.0" w:type="dxa"/>
+              <w:right w:w="100.0" w:type="dxa"/>
+            </w:tcMar>
+            <w:vAlign w:val="top"/>
+          </w:tcPr>
+          <w:p>
+            <w:pPr>
+              <w:spacing w:after="20" w:line="240" w:lineRule="auto"/>
+              <w:jc w:val="both"/>
+              <w:rPr/>
+            </w:pPr>
+            <w:r>
+              <w:rPr>
+                <w:rtl w:val="0"/>
+              </w:rPr>
+              <w:t xml:space="preserve">Muestra "El celular debe tener 8 dígitos." y marca el campo en rojo </w:t>
+            </w:r>
+          </w:p>
+        </w:tc>
+        <w:tc>
+          <w:tcPr>
+            <w:tcBorders>
+              <w:top w:color="000000" w:space="0" w:sz="4" w:val="single"/>
+              <w:left w:color="000000" w:space="0" w:sz="4" w:val="single"/>
+              <w:bottom w:color="000000" w:space="0" w:sz="4" w:val="single"/>
+              <w:right w:color="000000" w:space="0" w:sz="4" w:val="single"/>
+            </w:tcBorders>
+            <w:tcMar>
+              <w:top w:w="60.0" w:type="dxa"/>
+              <w:left w:w="100.0" w:type="dxa"/>
+              <w:bottom w:w="60.0" w:type="dxa"/>
+              <w:right w:w="100.0" w:type="dxa"/>
+            </w:tcMar>
+            <w:vAlign w:val="top"/>
+          </w:tcPr>
+          <w:p>
+            <w:pPr>
+              <w:spacing w:after="20" w:line="240" w:lineRule="auto"/>
+              <w:jc w:val="both"/>
+              <w:rPr/>
+            </w:pPr>
+            <w:r>
+              <w:rPr>
+                <w:rtl w:val="0"/>
+              </w:rPr>
+              <w:t xml:space="preserve">Pendiente </w:t>
             </w:r>
           </w:p>
         </w:tc>
@@ -30424,64 +30363,67 @@
               <w:rPr>
                 <w:rtl w:val="0"/>
               </w:rPr>
-            </w:r>
-          </w:p>
-        </w:tc>
-        <w:tc>
-          <w:tcPr>
-            <w:tcBorders>
-              <w:top w:color="000000" w:space="0" w:sz="4" w:val="single"/>
-              <w:left w:color="000000" w:space="0" w:sz="4" w:val="single"/>
-              <w:bottom w:color="000000" w:space="0" w:sz="4" w:val="single"/>
-              <w:right w:color="000000" w:space="0" w:sz="4" w:val="single"/>
-            </w:tcBorders>
-            <w:tcMar>
-              <w:top w:w="60.0" w:type="dxa"/>
-              <w:left w:w="100.0" w:type="dxa"/>
-              <w:bottom w:w="60.0" w:type="dxa"/>
-              <w:right w:w="100.0" w:type="dxa"/>
-            </w:tcMar>
-            <w:vAlign w:val="top"/>
-          </w:tcPr>
-          <w:p>
-            <w:pPr>
-              <w:spacing w:after="20" w:line="240" w:lineRule="auto"/>
-              <w:jc w:val="both"/>
-              <w:rPr/>
-            </w:pPr>
-            <w:r>
-              <w:rPr>
-                <w:rtl w:val="0"/>
-              </w:rPr>
-            </w:r>
-          </w:p>
-        </w:tc>
-        <w:tc>
-          <w:tcPr>
-            <w:tcBorders>
-              <w:top w:color="000000" w:space="0" w:sz="4" w:val="single"/>
-              <w:left w:color="000000" w:space="0" w:sz="4" w:val="single"/>
-              <w:bottom w:color="000000" w:space="0" w:sz="4" w:val="single"/>
-              <w:right w:color="000000" w:space="0" w:sz="4" w:val="single"/>
-            </w:tcBorders>
-            <w:tcMar>
-              <w:top w:w="60.0" w:type="dxa"/>
-              <w:left w:w="100.0" w:type="dxa"/>
-              <w:bottom w:w="60.0" w:type="dxa"/>
-              <w:right w:w="100.0" w:type="dxa"/>
-            </w:tcMar>
-            <w:vAlign w:val="top"/>
-          </w:tcPr>
-          <w:p>
-            <w:pPr>
-              <w:spacing w:after="20" w:line="240" w:lineRule="auto"/>
-              <w:jc w:val="both"/>
-              <w:rPr/>
-            </w:pPr>
-            <w:r>
-              <w:rPr>
-                <w:rtl w:val="0"/>
-              </w:rPr>
+              <w:t xml:space="preserve">Ingresar contraseña "abc123" (sin mayúscula y con menos de 8 caracteres) </w:t>
+            </w:r>
+          </w:p>
+        </w:tc>
+        <w:tc>
+          <w:tcPr>
+            <w:tcBorders>
+              <w:top w:color="000000" w:space="0" w:sz="4" w:val="single"/>
+              <w:left w:color="000000" w:space="0" w:sz="4" w:val="single"/>
+              <w:bottom w:color="000000" w:space="0" w:sz="4" w:val="single"/>
+              <w:right w:color="000000" w:space="0" w:sz="4" w:val="single"/>
+            </w:tcBorders>
+            <w:tcMar>
+              <w:top w:w="60.0" w:type="dxa"/>
+              <w:left w:w="100.0" w:type="dxa"/>
+              <w:bottom w:w="60.0" w:type="dxa"/>
+              <w:right w:w="100.0" w:type="dxa"/>
+            </w:tcMar>
+            <w:vAlign w:val="top"/>
+          </w:tcPr>
+          <w:p>
+            <w:pPr>
+              <w:spacing w:after="20" w:line="240" w:lineRule="auto"/>
+              <w:jc w:val="both"/>
+              <w:rPr/>
+            </w:pPr>
+            <w:r>
+              <w:rPr>
+                <w:rtl w:val="0"/>
+              </w:rPr>
+              <w:t xml:space="preserve">Muestra el mensaje de formato de contraseña y bloquea el envío </w:t>
+            </w:r>
+          </w:p>
+        </w:tc>
+        <w:tc>
+          <w:tcPr>
+            <w:tcBorders>
+              <w:top w:color="000000" w:space="0" w:sz="4" w:val="single"/>
+              <w:left w:color="000000" w:space="0" w:sz="4" w:val="single"/>
+              <w:bottom w:color="000000" w:space="0" w:sz="4" w:val="single"/>
+              <w:right w:color="000000" w:space="0" w:sz="4" w:val="single"/>
+            </w:tcBorders>
+            <w:tcMar>
+              <w:top w:w="60.0" w:type="dxa"/>
+              <w:left w:w="100.0" w:type="dxa"/>
+              <w:bottom w:w="60.0" w:type="dxa"/>
+              <w:right w:w="100.0" w:type="dxa"/>
+            </w:tcMar>
+            <w:vAlign w:val="top"/>
+          </w:tcPr>
+          <w:p>
+            <w:pPr>
+              <w:spacing w:after="20" w:line="240" w:lineRule="auto"/>
+              <w:jc w:val="both"/>
+              <w:rPr/>
+            </w:pPr>
+            <w:r>
+              <w:rPr>
+                <w:rtl w:val="0"/>
+              </w:rPr>
+              <w:t xml:space="preserve">Pendiente </w:t>
             </w:r>
           </w:p>
         </w:tc>
@@ -30518,95 +30460,101 @@
             </w:pPr>
             <w:r>
               <w:rPr>
-                <w:rtl w:val="0"/>
-              </w:rPr>
-            </w:r>
-          </w:p>
-        </w:tc>
-        <w:tc>
-          <w:tcPr>
-            <w:tcBorders>
-              <w:top w:color="000000" w:space="0" w:sz="4" w:val="single"/>
-              <w:left w:color="000000" w:space="0" w:sz="4" w:val="single"/>
-              <w:bottom w:color="000000" w:space="0" w:sz="4" w:val="single"/>
-              <w:right w:color="000000" w:space="0" w:sz="4" w:val="single"/>
-            </w:tcBorders>
-            <w:tcMar>
-              <w:top w:w="60.0" w:type="dxa"/>
-              <w:left w:w="100.0" w:type="dxa"/>
-              <w:bottom w:w="60.0" w:type="dxa"/>
-              <w:right w:w="100.0" w:type="dxa"/>
-            </w:tcMar>
-            <w:vAlign w:val="top"/>
-          </w:tcPr>
-          <w:p>
-            <w:pPr>
-              <w:spacing w:after="20" w:line="240" w:lineRule="auto"/>
-              <w:jc w:val="both"/>
-              <w:rPr/>
-            </w:pPr>
-            <w:r>
-              <w:rPr>
-                <w:rtl w:val="0"/>
-              </w:rPr>
-            </w:r>
-          </w:p>
-        </w:tc>
-        <w:tc>
-          <w:tcPr>
-            <w:tcBorders>
-              <w:top w:color="000000" w:space="0" w:sz="4" w:val="single"/>
-              <w:left w:color="000000" w:space="0" w:sz="4" w:val="single"/>
-              <w:bottom w:color="000000" w:space="0" w:sz="4" w:val="single"/>
-              <w:right w:color="000000" w:space="0" w:sz="4" w:val="single"/>
-            </w:tcBorders>
-            <w:tcMar>
-              <w:top w:w="60.0" w:type="dxa"/>
-              <w:left w:w="100.0" w:type="dxa"/>
-              <w:bottom w:w="60.0" w:type="dxa"/>
-              <w:right w:w="100.0" w:type="dxa"/>
-            </w:tcMar>
-            <w:vAlign w:val="top"/>
-          </w:tcPr>
-          <w:p>
-            <w:pPr>
-              <w:spacing w:after="20" w:line="240" w:lineRule="auto"/>
-              <w:jc w:val="both"/>
-              <w:rPr/>
-            </w:pPr>
-            <w:r>
-              <w:rPr>
-                <w:rtl w:val="0"/>
-              </w:rPr>
-            </w:r>
-          </w:p>
-        </w:tc>
-        <w:tc>
-          <w:tcPr>
-            <w:tcBorders>
-              <w:top w:color="000000" w:space="0" w:sz="4" w:val="single"/>
-              <w:left w:color="000000" w:space="0" w:sz="4" w:val="single"/>
-              <w:bottom w:color="000000" w:space="0" w:sz="4" w:val="single"/>
-              <w:right w:color="000000" w:space="0" w:sz="4" w:val="single"/>
-            </w:tcBorders>
-            <w:tcMar>
-              <w:top w:w="60.0" w:type="dxa"/>
-              <w:left w:w="100.0" w:type="dxa"/>
-              <w:bottom w:w="60.0" w:type="dxa"/>
-              <w:right w:w="100.0" w:type="dxa"/>
-            </w:tcMar>
-            <w:vAlign w:val="top"/>
-          </w:tcPr>
-          <w:p>
-            <w:pPr>
-              <w:spacing w:after="20" w:line="240" w:lineRule="auto"/>
-              <w:jc w:val="both"/>
-              <w:rPr/>
-            </w:pPr>
-            <w:r>
-              <w:rPr>
-                <w:rtl w:val="0"/>
-              </w:rPr>
+                <w:sz w:val="20"/>
+                <w:szCs w:val="20"/>
+                <w:rtl w:val="0"/>
+              </w:rPr>
+              <w:t xml:space="preserve">CP-04 </w:t>
+            </w:r>
+          </w:p>
+        </w:tc>
+        <w:tc>
+          <w:tcPr>
+            <w:tcBorders>
+              <w:top w:color="000000" w:space="0" w:sz="4" w:val="single"/>
+              <w:left w:color="000000" w:space="0" w:sz="4" w:val="single"/>
+              <w:bottom w:color="000000" w:space="0" w:sz="4" w:val="single"/>
+              <w:right w:color="000000" w:space="0" w:sz="4" w:val="single"/>
+            </w:tcBorders>
+            <w:tcMar>
+              <w:top w:w="60.0" w:type="dxa"/>
+              <w:left w:w="100.0" w:type="dxa"/>
+              <w:bottom w:w="60.0" w:type="dxa"/>
+              <w:right w:w="100.0" w:type="dxa"/>
+            </w:tcMar>
+            <w:vAlign w:val="top"/>
+          </w:tcPr>
+          <w:p>
+            <w:pPr>
+              <w:spacing w:after="20" w:line="240" w:lineRule="auto"/>
+              <w:jc w:val="both"/>
+              <w:rPr/>
+            </w:pPr>
+            <w:r>
+              <w:rPr>
+                <w:rtl w:val="0"/>
+              </w:rPr>
+              <w:t xml:space="preserve">Seleccionar una fechaNacimiento posterior a hoy </w:t>
+            </w:r>
+          </w:p>
+        </w:tc>
+        <w:tc>
+          <w:tcPr>
+            <w:tcBorders>
+              <w:top w:color="000000" w:space="0" w:sz="4" w:val="single"/>
+              <w:left w:color="000000" w:space="0" w:sz="4" w:val="single"/>
+              <w:bottom w:color="000000" w:space="0" w:sz="4" w:val="single"/>
+              <w:right w:color="000000" w:space="0" w:sz="4" w:val="single"/>
+            </w:tcBorders>
+            <w:tcMar>
+              <w:top w:w="60.0" w:type="dxa"/>
+              <w:left w:w="100.0" w:type="dxa"/>
+              <w:bottom w:w="60.0" w:type="dxa"/>
+              <w:right w:w="100.0" w:type="dxa"/>
+            </w:tcMar>
+            <w:vAlign w:val="top"/>
+          </w:tcPr>
+          <w:p>
+            <w:pPr>
+              <w:spacing w:after="20" w:line="240" w:lineRule="auto"/>
+              <w:jc w:val="both"/>
+              <w:rPr/>
+            </w:pPr>
+            <w:r>
+              <w:rPr>
+                <w:rtl w:val="0"/>
+              </w:rPr>
+              <w:t xml:space="preserve">Muestra "La fecha de nacimiento no es válida." </w:t>
+            </w:r>
+          </w:p>
+        </w:tc>
+        <w:tc>
+          <w:tcPr>
+            <w:tcBorders>
+              <w:top w:color="000000" w:space="0" w:sz="4" w:val="single"/>
+              <w:left w:color="000000" w:space="0" w:sz="4" w:val="single"/>
+              <w:bottom w:color="000000" w:space="0" w:sz="4" w:val="single"/>
+              <w:right w:color="000000" w:space="0" w:sz="4" w:val="single"/>
+            </w:tcBorders>
+            <w:tcMar>
+              <w:top w:w="60.0" w:type="dxa"/>
+              <w:left w:w="100.0" w:type="dxa"/>
+              <w:bottom w:w="60.0" w:type="dxa"/>
+              <w:right w:w="100.0" w:type="dxa"/>
+            </w:tcMar>
+            <w:vAlign w:val="top"/>
+          </w:tcPr>
+          <w:p>
+            <w:pPr>
+              <w:spacing w:after="20" w:line="240" w:lineRule="auto"/>
+              <w:jc w:val="both"/>
+              <w:rPr/>
+            </w:pPr>
+            <w:r>
+              <w:rPr>
+                <w:rtl w:val="0"/>
+              </w:rPr>
+              <w:t xml:space="preserve">Pendiente </w:t>
             </w:r>
           </w:p>
         </w:tc>
@@ -30643,95 +30591,101 @@
             </w:pPr>
             <w:r>
               <w:rPr>
-                <w:rtl w:val="0"/>
-              </w:rPr>
-            </w:r>
-          </w:p>
-        </w:tc>
-        <w:tc>
-          <w:tcPr>
-            <w:tcBorders>
-              <w:top w:color="000000" w:space="0" w:sz="4" w:val="single"/>
-              <w:left w:color="000000" w:space="0" w:sz="4" w:val="single"/>
-              <w:bottom w:color="000000" w:space="0" w:sz="4" w:val="single"/>
-              <w:right w:color="000000" w:space="0" w:sz="4" w:val="single"/>
-            </w:tcBorders>
-            <w:tcMar>
-              <w:top w:w="60.0" w:type="dxa"/>
-              <w:left w:w="100.0" w:type="dxa"/>
-              <w:bottom w:w="60.0" w:type="dxa"/>
-              <w:right w:w="100.0" w:type="dxa"/>
-            </w:tcMar>
-            <w:vAlign w:val="top"/>
-          </w:tcPr>
-          <w:p>
-            <w:pPr>
-              <w:spacing w:after="20" w:line="240" w:lineRule="auto"/>
-              <w:jc w:val="both"/>
-              <w:rPr/>
-            </w:pPr>
-            <w:r>
-              <w:rPr>
-                <w:rtl w:val="0"/>
-              </w:rPr>
-            </w:r>
-          </w:p>
-        </w:tc>
-        <w:tc>
-          <w:tcPr>
-            <w:tcBorders>
-              <w:top w:color="000000" w:space="0" w:sz="4" w:val="single"/>
-              <w:left w:color="000000" w:space="0" w:sz="4" w:val="single"/>
-              <w:bottom w:color="000000" w:space="0" w:sz="4" w:val="single"/>
-              <w:right w:color="000000" w:space="0" w:sz="4" w:val="single"/>
-            </w:tcBorders>
-            <w:tcMar>
-              <w:top w:w="60.0" w:type="dxa"/>
-              <w:left w:w="100.0" w:type="dxa"/>
-              <w:bottom w:w="60.0" w:type="dxa"/>
-              <w:right w:w="100.0" w:type="dxa"/>
-            </w:tcMar>
-            <w:vAlign w:val="top"/>
-          </w:tcPr>
-          <w:p>
-            <w:pPr>
-              <w:spacing w:after="20" w:line="240" w:lineRule="auto"/>
-              <w:jc w:val="both"/>
-              <w:rPr/>
-            </w:pPr>
-            <w:r>
-              <w:rPr>
-                <w:rtl w:val="0"/>
-              </w:rPr>
-            </w:r>
-          </w:p>
-        </w:tc>
-        <w:tc>
-          <w:tcPr>
-            <w:tcBorders>
-              <w:top w:color="000000" w:space="0" w:sz="4" w:val="single"/>
-              <w:left w:color="000000" w:space="0" w:sz="4" w:val="single"/>
-              <w:bottom w:color="000000" w:space="0" w:sz="4" w:val="single"/>
-              <w:right w:color="000000" w:space="0" w:sz="4" w:val="single"/>
-            </w:tcBorders>
-            <w:tcMar>
-              <w:top w:w="60.0" w:type="dxa"/>
-              <w:left w:w="100.0" w:type="dxa"/>
-              <w:bottom w:w="60.0" w:type="dxa"/>
-              <w:right w:w="100.0" w:type="dxa"/>
-            </w:tcMar>
-            <w:vAlign w:val="top"/>
-          </w:tcPr>
-          <w:p>
-            <w:pPr>
-              <w:spacing w:after="20" w:line="240" w:lineRule="auto"/>
-              <w:jc w:val="both"/>
-              <w:rPr/>
-            </w:pPr>
-            <w:r>
-              <w:rPr>
-                <w:rtl w:val="0"/>
-              </w:rPr>
+                <w:sz w:val="20"/>
+                <w:szCs w:val="20"/>
+                <w:rtl w:val="0"/>
+              </w:rPr>
+              <w:t xml:space="preserve">CP-05</w:t>
+            </w:r>
+          </w:p>
+        </w:tc>
+        <w:tc>
+          <w:tcPr>
+            <w:tcBorders>
+              <w:top w:color="000000" w:space="0" w:sz="4" w:val="single"/>
+              <w:left w:color="000000" w:space="0" w:sz="4" w:val="single"/>
+              <w:bottom w:color="000000" w:space="0" w:sz="4" w:val="single"/>
+              <w:right w:color="000000" w:space="0" w:sz="4" w:val="single"/>
+            </w:tcBorders>
+            <w:tcMar>
+              <w:top w:w="60.0" w:type="dxa"/>
+              <w:left w:w="100.0" w:type="dxa"/>
+              <w:bottom w:w="60.0" w:type="dxa"/>
+              <w:right w:w="100.0" w:type="dxa"/>
+            </w:tcMar>
+            <w:vAlign w:val="top"/>
+          </w:tcPr>
+          <w:p>
+            <w:pPr>
+              <w:spacing w:after="20" w:line="240" w:lineRule="auto"/>
+              <w:jc w:val="both"/>
+              <w:rPr/>
+            </w:pPr>
+            <w:r>
+              <w:rPr>
+                <w:rtl w:val="0"/>
+              </w:rPr>
+              <w:t xml:space="preserve">Subir un archivo .txt en archivoCsv </w:t>
+            </w:r>
+          </w:p>
+        </w:tc>
+        <w:tc>
+          <w:tcPr>
+            <w:tcBorders>
+              <w:top w:color="000000" w:space="0" w:sz="4" w:val="single"/>
+              <w:left w:color="000000" w:space="0" w:sz="4" w:val="single"/>
+              <w:bottom w:color="000000" w:space="0" w:sz="4" w:val="single"/>
+              <w:right w:color="000000" w:space="0" w:sz="4" w:val="single"/>
+            </w:tcBorders>
+            <w:tcMar>
+              <w:top w:w="60.0" w:type="dxa"/>
+              <w:left w:w="100.0" w:type="dxa"/>
+              <w:bottom w:w="60.0" w:type="dxa"/>
+              <w:right w:w="100.0" w:type="dxa"/>
+            </w:tcMar>
+            <w:vAlign w:val="top"/>
+          </w:tcPr>
+          <w:p>
+            <w:pPr>
+              <w:spacing w:after="20" w:line="240" w:lineRule="auto"/>
+              <w:jc w:val="both"/>
+              <w:rPr/>
+            </w:pPr>
+            <w:r>
+              <w:rPr>
+                <w:rtl w:val="0"/>
+              </w:rPr>
+              <w:t xml:space="preserve">Muestra "El archivo debe tener formato .csv." </w:t>
+            </w:r>
+          </w:p>
+        </w:tc>
+        <w:tc>
+          <w:tcPr>
+            <w:tcBorders>
+              <w:top w:color="000000" w:space="0" w:sz="4" w:val="single"/>
+              <w:left w:color="000000" w:space="0" w:sz="4" w:val="single"/>
+              <w:bottom w:color="000000" w:space="0" w:sz="4" w:val="single"/>
+              <w:right w:color="000000" w:space="0" w:sz="4" w:val="single"/>
+            </w:tcBorders>
+            <w:tcMar>
+              <w:top w:w="60.0" w:type="dxa"/>
+              <w:left w:w="100.0" w:type="dxa"/>
+              <w:bottom w:w="60.0" w:type="dxa"/>
+              <w:right w:w="100.0" w:type="dxa"/>
+            </w:tcMar>
+            <w:vAlign w:val="top"/>
+          </w:tcPr>
+          <w:p>
+            <w:pPr>
+              <w:spacing w:after="20" w:line="240" w:lineRule="auto"/>
+              <w:jc w:val="both"/>
+              <w:rPr/>
+            </w:pPr>
+            <w:r>
+              <w:rPr>
+                <w:rtl w:val="0"/>
+              </w:rPr>
+              <w:t xml:space="preserve">Pendiente </w:t>
             </w:r>
           </w:p>
         </w:tc>
@@ -30768,95 +30722,101 @@
             </w:pPr>
             <w:r>
               <w:rPr>
-                <w:rtl w:val="0"/>
-              </w:rPr>
-            </w:r>
-          </w:p>
-        </w:tc>
-        <w:tc>
-          <w:tcPr>
-            <w:tcBorders>
-              <w:top w:color="000000" w:space="0" w:sz="4" w:val="single"/>
-              <w:left w:color="000000" w:space="0" w:sz="4" w:val="single"/>
-              <w:bottom w:color="000000" w:space="0" w:sz="4" w:val="single"/>
-              <w:right w:color="000000" w:space="0" w:sz="4" w:val="single"/>
-            </w:tcBorders>
-            <w:tcMar>
-              <w:top w:w="60.0" w:type="dxa"/>
-              <w:left w:w="100.0" w:type="dxa"/>
-              <w:bottom w:w="60.0" w:type="dxa"/>
-              <w:right w:w="100.0" w:type="dxa"/>
-            </w:tcMar>
-            <w:vAlign w:val="top"/>
-          </w:tcPr>
-          <w:p>
-            <w:pPr>
-              <w:spacing w:after="20" w:line="240" w:lineRule="auto"/>
-              <w:jc w:val="both"/>
-              <w:rPr/>
-            </w:pPr>
-            <w:r>
-              <w:rPr>
-                <w:rtl w:val="0"/>
-              </w:rPr>
-            </w:r>
-          </w:p>
-        </w:tc>
-        <w:tc>
-          <w:tcPr>
-            <w:tcBorders>
-              <w:top w:color="000000" w:space="0" w:sz="4" w:val="single"/>
-              <w:left w:color="000000" w:space="0" w:sz="4" w:val="single"/>
-              <w:bottom w:color="000000" w:space="0" w:sz="4" w:val="single"/>
-              <w:right w:color="000000" w:space="0" w:sz="4" w:val="single"/>
-            </w:tcBorders>
-            <w:tcMar>
-              <w:top w:w="60.0" w:type="dxa"/>
-              <w:left w:w="100.0" w:type="dxa"/>
-              <w:bottom w:w="60.0" w:type="dxa"/>
-              <w:right w:w="100.0" w:type="dxa"/>
-            </w:tcMar>
-            <w:vAlign w:val="top"/>
-          </w:tcPr>
-          <w:p>
-            <w:pPr>
-              <w:spacing w:after="20" w:line="240" w:lineRule="auto"/>
-              <w:jc w:val="both"/>
-              <w:rPr/>
-            </w:pPr>
-            <w:r>
-              <w:rPr>
-                <w:rtl w:val="0"/>
-              </w:rPr>
-            </w:r>
-          </w:p>
-        </w:tc>
-        <w:tc>
-          <w:tcPr>
-            <w:tcBorders>
-              <w:top w:color="000000" w:space="0" w:sz="4" w:val="single"/>
-              <w:left w:color="000000" w:space="0" w:sz="4" w:val="single"/>
-              <w:bottom w:color="000000" w:space="0" w:sz="4" w:val="single"/>
-              <w:right w:color="000000" w:space="0" w:sz="4" w:val="single"/>
-            </w:tcBorders>
-            <w:tcMar>
-              <w:top w:w="60.0" w:type="dxa"/>
-              <w:left w:w="100.0" w:type="dxa"/>
-              <w:bottom w:w="60.0" w:type="dxa"/>
-              <w:right w:w="100.0" w:type="dxa"/>
-            </w:tcMar>
-            <w:vAlign w:val="top"/>
-          </w:tcPr>
-          <w:p>
-            <w:pPr>
-              <w:spacing w:after="20" w:line="240" w:lineRule="auto"/>
-              <w:jc w:val="both"/>
-              <w:rPr/>
-            </w:pPr>
-            <w:r>
-              <w:rPr>
-                <w:rtl w:val="0"/>
-              </w:rPr>
+                <w:sz w:val="20"/>
+                <w:szCs w:val="20"/>
+                <w:rtl w:val="0"/>
+              </w:rPr>
+              <w:t xml:space="preserve">CP-06 </w:t>
+            </w:r>
+          </w:p>
+        </w:tc>
+        <w:tc>
+          <w:tcPr>
+            <w:tcBorders>
+              <w:top w:color="000000" w:space="0" w:sz="4" w:val="single"/>
+              <w:left w:color="000000" w:space="0" w:sz="4" w:val="single"/>
+              <w:bottom w:color="000000" w:space="0" w:sz="4" w:val="single"/>
+              <w:right w:color="000000" w:space="0" w:sz="4" w:val="single"/>
+            </w:tcBorders>
+            <w:tcMar>
+              <w:top w:w="60.0" w:type="dxa"/>
+              <w:left w:w="100.0" w:type="dxa"/>
+              <w:bottom w:w="60.0" w:type="dxa"/>
+              <w:right w:w="100.0" w:type="dxa"/>
+            </w:tcMar>
+            <w:vAlign w:val="top"/>
+          </w:tcPr>
+          <w:p>
+            <w:pPr>
+              <w:spacing w:after="20" w:line="240" w:lineRule="auto"/>
+              <w:jc w:val="both"/>
+              <w:rPr/>
+            </w:pPr>
+            <w:r>
+              <w:rPr>
+                <w:rtl w:val="0"/>
+              </w:rPr>
+              <w:t xml:space="preserve">Escribir más de 250 caracteres en descripcionCorta </w:t>
+            </w:r>
+          </w:p>
+        </w:tc>
+        <w:tc>
+          <w:tcPr>
+            <w:tcBorders>
+              <w:top w:color="000000" w:space="0" w:sz="4" w:val="single"/>
+              <w:left w:color="000000" w:space="0" w:sz="4" w:val="single"/>
+              <w:bottom w:color="000000" w:space="0" w:sz="4" w:val="single"/>
+              <w:right w:color="000000" w:space="0" w:sz="4" w:val="single"/>
+            </w:tcBorders>
+            <w:tcMar>
+              <w:top w:w="60.0" w:type="dxa"/>
+              <w:left w:w="100.0" w:type="dxa"/>
+              <w:bottom w:w="60.0" w:type="dxa"/>
+              <w:right w:w="100.0" w:type="dxa"/>
+            </w:tcMar>
+            <w:vAlign w:val="top"/>
+          </w:tcPr>
+          <w:p>
+            <w:pPr>
+              <w:spacing w:after="20" w:line="240" w:lineRule="auto"/>
+              <w:jc w:val="both"/>
+              <w:rPr/>
+            </w:pPr>
+            <w:r>
+              <w:rPr>
+                <w:rtl w:val="0"/>
+              </w:rPr>
+              <w:t xml:space="preserve">El contador cambia a rojo y muestra el mensaje de límite excedido </w:t>
+            </w:r>
+          </w:p>
+        </w:tc>
+        <w:tc>
+          <w:tcPr>
+            <w:tcBorders>
+              <w:top w:color="000000" w:space="0" w:sz="4" w:val="single"/>
+              <w:left w:color="000000" w:space="0" w:sz="4" w:val="single"/>
+              <w:bottom w:color="000000" w:space="0" w:sz="4" w:val="single"/>
+              <w:right w:color="000000" w:space="0" w:sz="4" w:val="single"/>
+            </w:tcBorders>
+            <w:tcMar>
+              <w:top w:w="60.0" w:type="dxa"/>
+              <w:left w:w="100.0" w:type="dxa"/>
+              <w:bottom w:w="60.0" w:type="dxa"/>
+              <w:right w:w="100.0" w:type="dxa"/>
+            </w:tcMar>
+            <w:vAlign w:val="top"/>
+          </w:tcPr>
+          <w:p>
+            <w:pPr>
+              <w:spacing w:after="20" w:line="240" w:lineRule="auto"/>
+              <w:jc w:val="both"/>
+              <w:rPr/>
+            </w:pPr>
+            <w:r>
+              <w:rPr>
+                <w:rtl w:val="0"/>
+              </w:rPr>
+              <w:t xml:space="preserve">Pendiente </w:t>
             </w:r>
           </w:p>
         </w:tc>
@@ -30893,95 +30853,101 @@
             </w:pPr>
             <w:r>
               <w:rPr>
-                <w:rtl w:val="0"/>
-              </w:rPr>
-            </w:r>
-          </w:p>
-        </w:tc>
-        <w:tc>
-          <w:tcPr>
-            <w:tcBorders>
-              <w:top w:color="000000" w:space="0" w:sz="4" w:val="single"/>
-              <w:left w:color="000000" w:space="0" w:sz="4" w:val="single"/>
-              <w:bottom w:color="000000" w:space="0" w:sz="4" w:val="single"/>
-              <w:right w:color="000000" w:space="0" w:sz="4" w:val="single"/>
-            </w:tcBorders>
-            <w:tcMar>
-              <w:top w:w="60.0" w:type="dxa"/>
-              <w:left w:w="100.0" w:type="dxa"/>
-              <w:bottom w:w="60.0" w:type="dxa"/>
-              <w:right w:w="100.0" w:type="dxa"/>
-            </w:tcMar>
-            <w:vAlign w:val="top"/>
-          </w:tcPr>
-          <w:p>
-            <w:pPr>
-              <w:spacing w:after="20" w:line="240" w:lineRule="auto"/>
-              <w:jc w:val="both"/>
-              <w:rPr/>
-            </w:pPr>
-            <w:r>
-              <w:rPr>
-                <w:rtl w:val="0"/>
-              </w:rPr>
-            </w:r>
-          </w:p>
-        </w:tc>
-        <w:tc>
-          <w:tcPr>
-            <w:tcBorders>
-              <w:top w:color="000000" w:space="0" w:sz="4" w:val="single"/>
-              <w:left w:color="000000" w:space="0" w:sz="4" w:val="single"/>
-              <w:bottom w:color="000000" w:space="0" w:sz="4" w:val="single"/>
-              <w:right w:color="000000" w:space="0" w:sz="4" w:val="single"/>
-            </w:tcBorders>
-            <w:tcMar>
-              <w:top w:w="60.0" w:type="dxa"/>
-              <w:left w:w="100.0" w:type="dxa"/>
-              <w:bottom w:w="60.0" w:type="dxa"/>
-              <w:right w:w="100.0" w:type="dxa"/>
-            </w:tcMar>
-            <w:vAlign w:val="top"/>
-          </w:tcPr>
-          <w:p>
-            <w:pPr>
-              <w:spacing w:after="20" w:line="240" w:lineRule="auto"/>
-              <w:jc w:val="both"/>
-              <w:rPr/>
-            </w:pPr>
-            <w:r>
-              <w:rPr>
-                <w:rtl w:val="0"/>
-              </w:rPr>
-            </w:r>
-          </w:p>
-        </w:tc>
-        <w:tc>
-          <w:tcPr>
-            <w:tcBorders>
-              <w:top w:color="000000" w:space="0" w:sz="4" w:val="single"/>
-              <w:left w:color="000000" w:space="0" w:sz="4" w:val="single"/>
-              <w:bottom w:color="000000" w:space="0" w:sz="4" w:val="single"/>
-              <w:right w:color="000000" w:space="0" w:sz="4" w:val="single"/>
-            </w:tcBorders>
-            <w:tcMar>
-              <w:top w:w="60.0" w:type="dxa"/>
-              <w:left w:w="100.0" w:type="dxa"/>
-              <w:bottom w:w="60.0" w:type="dxa"/>
-              <w:right w:w="100.0" w:type="dxa"/>
-            </w:tcMar>
-            <w:vAlign w:val="top"/>
-          </w:tcPr>
-          <w:p>
-            <w:pPr>
-              <w:spacing w:after="20" w:line="240" w:lineRule="auto"/>
-              <w:jc w:val="both"/>
-              <w:rPr/>
-            </w:pPr>
-            <w:r>
-              <w:rPr>
-                <w:rtl w:val="0"/>
-              </w:rPr>
+                <w:sz w:val="20"/>
+                <w:szCs w:val="20"/>
+                <w:rtl w:val="0"/>
+              </w:rPr>
+              <w:t xml:space="preserve">CP-07 </w:t>
+            </w:r>
+          </w:p>
+        </w:tc>
+        <w:tc>
+          <w:tcPr>
+            <w:tcBorders>
+              <w:top w:color="000000" w:space="0" w:sz="4" w:val="single"/>
+              <w:left w:color="000000" w:space="0" w:sz="4" w:val="single"/>
+              <w:bottom w:color="000000" w:space="0" w:sz="4" w:val="single"/>
+              <w:right w:color="000000" w:space="0" w:sz="4" w:val="single"/>
+            </w:tcBorders>
+            <w:tcMar>
+              <w:top w:w="60.0" w:type="dxa"/>
+              <w:left w:w="100.0" w:type="dxa"/>
+              <w:bottom w:w="60.0" w:type="dxa"/>
+              <w:right w:w="100.0" w:type="dxa"/>
+            </w:tcMar>
+            <w:vAlign w:val="top"/>
+          </w:tcPr>
+          <w:p>
+            <w:pPr>
+              <w:spacing w:after="20" w:line="240" w:lineRule="auto"/>
+              <w:jc w:val="both"/>
+              <w:rPr/>
+            </w:pPr>
+            <w:r>
+              <w:rPr>
+                <w:rtl w:val="0"/>
+              </w:rPr>
+              <w:t xml:space="preserve">Ingresar 0 en horasClase </w:t>
+            </w:r>
+          </w:p>
+        </w:tc>
+        <w:tc>
+          <w:tcPr>
+            <w:tcBorders>
+              <w:top w:color="000000" w:space="0" w:sz="4" w:val="single"/>
+              <w:left w:color="000000" w:space="0" w:sz="4" w:val="single"/>
+              <w:bottom w:color="000000" w:space="0" w:sz="4" w:val="single"/>
+              <w:right w:color="000000" w:space="0" w:sz="4" w:val="single"/>
+            </w:tcBorders>
+            <w:tcMar>
+              <w:top w:w="60.0" w:type="dxa"/>
+              <w:left w:w="100.0" w:type="dxa"/>
+              <w:bottom w:w="60.0" w:type="dxa"/>
+              <w:right w:w="100.0" w:type="dxa"/>
+            </w:tcMar>
+            <w:vAlign w:val="top"/>
+          </w:tcPr>
+          <w:p>
+            <w:pPr>
+              <w:spacing w:after="20" w:line="240" w:lineRule="auto"/>
+              <w:jc w:val="both"/>
+              <w:rPr/>
+            </w:pPr>
+            <w:r>
+              <w:rPr>
+                <w:rtl w:val="0"/>
+              </w:rPr>
+              <w:t xml:space="preserve">Muestra el mensaje de número mínimo (debe ser mayor o igual a 1) </w:t>
+            </w:r>
+          </w:p>
+        </w:tc>
+        <w:tc>
+          <w:tcPr>
+            <w:tcBorders>
+              <w:top w:color="000000" w:space="0" w:sz="4" w:val="single"/>
+              <w:left w:color="000000" w:space="0" w:sz="4" w:val="single"/>
+              <w:bottom w:color="000000" w:space="0" w:sz="4" w:val="single"/>
+              <w:right w:color="000000" w:space="0" w:sz="4" w:val="single"/>
+            </w:tcBorders>
+            <w:tcMar>
+              <w:top w:w="60.0" w:type="dxa"/>
+              <w:left w:w="100.0" w:type="dxa"/>
+              <w:bottom w:w="60.0" w:type="dxa"/>
+              <w:right w:w="100.0" w:type="dxa"/>
+            </w:tcMar>
+            <w:vAlign w:val="top"/>
+          </w:tcPr>
+          <w:p>
+            <w:pPr>
+              <w:spacing w:after="20" w:line="240" w:lineRule="auto"/>
+              <w:jc w:val="both"/>
+              <w:rPr/>
+            </w:pPr>
+            <w:r>
+              <w:rPr>
+                <w:rtl w:val="0"/>
+              </w:rPr>
+              <w:t xml:space="preserve">Pendiente </w:t>
             </w:r>
           </w:p>
         </w:tc>
@@ -31018,95 +30984,101 @@
             </w:pPr>
             <w:r>
               <w:rPr>
-                <w:rtl w:val="0"/>
-              </w:rPr>
-            </w:r>
-          </w:p>
-        </w:tc>
-        <w:tc>
-          <w:tcPr>
-            <w:tcBorders>
-              <w:top w:color="000000" w:space="0" w:sz="4" w:val="single"/>
-              <w:left w:color="000000" w:space="0" w:sz="4" w:val="single"/>
-              <w:bottom w:color="000000" w:space="0" w:sz="4" w:val="single"/>
-              <w:right w:color="000000" w:space="0" w:sz="4" w:val="single"/>
-            </w:tcBorders>
-            <w:tcMar>
-              <w:top w:w="60.0" w:type="dxa"/>
-              <w:left w:w="100.0" w:type="dxa"/>
-              <w:bottom w:w="60.0" w:type="dxa"/>
-              <w:right w:w="100.0" w:type="dxa"/>
-            </w:tcMar>
-            <w:vAlign w:val="top"/>
-          </w:tcPr>
-          <w:p>
-            <w:pPr>
-              <w:spacing w:after="20" w:line="240" w:lineRule="auto"/>
-              <w:jc w:val="both"/>
-              <w:rPr/>
-            </w:pPr>
-            <w:r>
-              <w:rPr>
-                <w:rtl w:val="0"/>
-              </w:rPr>
-            </w:r>
-          </w:p>
-        </w:tc>
-        <w:tc>
-          <w:tcPr>
-            <w:tcBorders>
-              <w:top w:color="000000" w:space="0" w:sz="4" w:val="single"/>
-              <w:left w:color="000000" w:space="0" w:sz="4" w:val="single"/>
-              <w:bottom w:color="000000" w:space="0" w:sz="4" w:val="single"/>
-              <w:right w:color="000000" w:space="0" w:sz="4" w:val="single"/>
-            </w:tcBorders>
-            <w:tcMar>
-              <w:top w:w="60.0" w:type="dxa"/>
-              <w:left w:w="100.0" w:type="dxa"/>
-              <w:bottom w:w="60.0" w:type="dxa"/>
-              <w:right w:w="100.0" w:type="dxa"/>
-            </w:tcMar>
-            <w:vAlign w:val="top"/>
-          </w:tcPr>
-          <w:p>
-            <w:pPr>
-              <w:spacing w:after="20" w:line="240" w:lineRule="auto"/>
-              <w:jc w:val="both"/>
-              <w:rPr/>
-            </w:pPr>
-            <w:r>
-              <w:rPr>
-                <w:rtl w:val="0"/>
-              </w:rPr>
-            </w:r>
-          </w:p>
-        </w:tc>
-        <w:tc>
-          <w:tcPr>
-            <w:tcBorders>
-              <w:top w:color="000000" w:space="0" w:sz="4" w:val="single"/>
-              <w:left w:color="000000" w:space="0" w:sz="4" w:val="single"/>
-              <w:bottom w:color="000000" w:space="0" w:sz="4" w:val="single"/>
-              <w:right w:color="000000" w:space="0" w:sz="4" w:val="single"/>
-            </w:tcBorders>
-            <w:tcMar>
-              <w:top w:w="60.0" w:type="dxa"/>
-              <w:left w:w="100.0" w:type="dxa"/>
-              <w:bottom w:w="60.0" w:type="dxa"/>
-              <w:right w:w="100.0" w:type="dxa"/>
-            </w:tcMar>
-            <w:vAlign w:val="top"/>
-          </w:tcPr>
-          <w:p>
-            <w:pPr>
-              <w:spacing w:after="20" w:line="240" w:lineRule="auto"/>
-              <w:jc w:val="both"/>
-              <w:rPr/>
-            </w:pPr>
-            <w:r>
-              <w:rPr>
-                <w:rtl w:val="0"/>
-              </w:rPr>
+                <w:sz w:val="20"/>
+                <w:szCs w:val="20"/>
+                <w:rtl w:val="0"/>
+              </w:rPr>
+              <w:t xml:space="preserve">CP-08 </w:t>
+            </w:r>
+          </w:p>
+        </w:tc>
+        <w:tc>
+          <w:tcPr>
+            <w:tcBorders>
+              <w:top w:color="000000" w:space="0" w:sz="4" w:val="single"/>
+              <w:left w:color="000000" w:space="0" w:sz="4" w:val="single"/>
+              <w:bottom w:color="000000" w:space="0" w:sz="4" w:val="single"/>
+              <w:right w:color="000000" w:space="0" w:sz="4" w:val="single"/>
+            </w:tcBorders>
+            <w:tcMar>
+              <w:top w:w="60.0" w:type="dxa"/>
+              <w:left w:w="100.0" w:type="dxa"/>
+              <w:bottom w:w="60.0" w:type="dxa"/>
+              <w:right w:w="100.0" w:type="dxa"/>
+            </w:tcMar>
+            <w:vAlign w:val="top"/>
+          </w:tcPr>
+          <w:p>
+            <w:pPr>
+              <w:spacing w:after="20" w:line="240" w:lineRule="auto"/>
+              <w:jc w:val="both"/>
+              <w:rPr/>
+            </w:pPr>
+            <w:r>
+              <w:rPr>
+                <w:rtl w:val="0"/>
+              </w:rPr>
+              <w:t xml:space="preserve">Completar correctamente todos los campos obligatorios de formUsuario y enviar </w:t>
+            </w:r>
+          </w:p>
+        </w:tc>
+        <w:tc>
+          <w:tcPr>
+            <w:tcBorders>
+              <w:top w:color="000000" w:space="0" w:sz="4" w:val="single"/>
+              <w:left w:color="000000" w:space="0" w:sz="4" w:val="single"/>
+              <w:bottom w:color="000000" w:space="0" w:sz="4" w:val="single"/>
+              <w:right w:color="000000" w:space="0" w:sz="4" w:val="single"/>
+            </w:tcBorders>
+            <w:tcMar>
+              <w:top w:w="60.0" w:type="dxa"/>
+              <w:left w:w="100.0" w:type="dxa"/>
+              <w:bottom w:w="60.0" w:type="dxa"/>
+              <w:right w:w="100.0" w:type="dxa"/>
+            </w:tcMar>
+            <w:vAlign w:val="top"/>
+          </w:tcPr>
+          <w:p>
+            <w:pPr>
+              <w:spacing w:after="20" w:line="240" w:lineRule="auto"/>
+              <w:jc w:val="both"/>
+              <w:rPr/>
+            </w:pPr>
+            <w:r>
+              <w:rPr>
+                <w:rtl w:val="0"/>
+              </w:rPr>
+              <w:t xml:space="preserve">No aparece ningún error, todos los campos quedan en verde y el formulario se envía </w:t>
+            </w:r>
+          </w:p>
+        </w:tc>
+        <w:tc>
+          <w:tcPr>
+            <w:tcBorders>
+              <w:top w:color="000000" w:space="0" w:sz="4" w:val="single"/>
+              <w:left w:color="000000" w:space="0" w:sz="4" w:val="single"/>
+              <w:bottom w:color="000000" w:space="0" w:sz="4" w:val="single"/>
+              <w:right w:color="000000" w:space="0" w:sz="4" w:val="single"/>
+            </w:tcBorders>
+            <w:tcMar>
+              <w:top w:w="60.0" w:type="dxa"/>
+              <w:left w:w="100.0" w:type="dxa"/>
+              <w:bottom w:w="60.0" w:type="dxa"/>
+              <w:right w:w="100.0" w:type="dxa"/>
+            </w:tcMar>
+            <w:vAlign w:val="top"/>
+          </w:tcPr>
+          <w:p>
+            <w:pPr>
+              <w:spacing w:after="20" w:line="240" w:lineRule="auto"/>
+              <w:jc w:val="both"/>
+              <w:rPr/>
+            </w:pPr>
+            <w:r>
+              <w:rPr>
+                <w:rtl w:val="0"/>
+              </w:rPr>
+              <w:t xml:space="preserve">Pendiente </w:t>
             </w:r>
           </w:p>
         </w:tc>
@@ -31143,95 +31115,101 @@
             </w:pPr>
             <w:r>
               <w:rPr>
-                <w:rtl w:val="0"/>
-              </w:rPr>
-            </w:r>
-          </w:p>
-        </w:tc>
-        <w:tc>
-          <w:tcPr>
-            <w:tcBorders>
-              <w:top w:color="000000" w:space="0" w:sz="4" w:val="single"/>
-              <w:left w:color="000000" w:space="0" w:sz="4" w:val="single"/>
-              <w:bottom w:color="000000" w:space="0" w:sz="4" w:val="single"/>
-              <w:right w:color="000000" w:space="0" w:sz="4" w:val="single"/>
-            </w:tcBorders>
-            <w:tcMar>
-              <w:top w:w="60.0" w:type="dxa"/>
-              <w:left w:w="100.0" w:type="dxa"/>
-              <w:bottom w:w="60.0" w:type="dxa"/>
-              <w:right w:w="100.0" w:type="dxa"/>
-            </w:tcMar>
-            <w:vAlign w:val="top"/>
-          </w:tcPr>
-          <w:p>
-            <w:pPr>
-              <w:spacing w:after="20" w:line="240" w:lineRule="auto"/>
-              <w:jc w:val="both"/>
-              <w:rPr/>
-            </w:pPr>
-            <w:r>
-              <w:rPr>
-                <w:rtl w:val="0"/>
-              </w:rPr>
-            </w:r>
-          </w:p>
-        </w:tc>
-        <w:tc>
-          <w:tcPr>
-            <w:tcBorders>
-              <w:top w:color="000000" w:space="0" w:sz="4" w:val="single"/>
-              <w:left w:color="000000" w:space="0" w:sz="4" w:val="single"/>
-              <w:bottom w:color="000000" w:space="0" w:sz="4" w:val="single"/>
-              <w:right w:color="000000" w:space="0" w:sz="4" w:val="single"/>
-            </w:tcBorders>
-            <w:tcMar>
-              <w:top w:w="60.0" w:type="dxa"/>
-              <w:left w:w="100.0" w:type="dxa"/>
-              <w:bottom w:w="60.0" w:type="dxa"/>
-              <w:right w:w="100.0" w:type="dxa"/>
-            </w:tcMar>
-            <w:vAlign w:val="top"/>
-          </w:tcPr>
-          <w:p>
-            <w:pPr>
-              <w:spacing w:after="20" w:line="240" w:lineRule="auto"/>
-              <w:jc w:val="both"/>
-              <w:rPr/>
-            </w:pPr>
-            <w:r>
-              <w:rPr>
-                <w:rtl w:val="0"/>
-              </w:rPr>
-            </w:r>
-          </w:p>
-        </w:tc>
-        <w:tc>
-          <w:tcPr>
-            <w:tcBorders>
-              <w:top w:color="000000" w:space="0" w:sz="4" w:val="single"/>
-              <w:left w:color="000000" w:space="0" w:sz="4" w:val="single"/>
-              <w:bottom w:color="000000" w:space="0" w:sz="4" w:val="single"/>
-              <w:right w:color="000000" w:space="0" w:sz="4" w:val="single"/>
-            </w:tcBorders>
-            <w:tcMar>
-              <w:top w:w="60.0" w:type="dxa"/>
-              <w:left w:w="100.0" w:type="dxa"/>
-              <w:bottom w:w="60.0" w:type="dxa"/>
-              <w:right w:w="100.0" w:type="dxa"/>
-            </w:tcMar>
-            <w:vAlign w:val="top"/>
-          </w:tcPr>
-          <w:p>
-            <w:pPr>
-              <w:spacing w:after="20" w:line="240" w:lineRule="auto"/>
-              <w:jc w:val="both"/>
-              <w:rPr/>
-            </w:pPr>
-            <w:r>
-              <w:rPr>
-                <w:rtl w:val="0"/>
-              </w:rPr>
+                <w:sz w:val="20"/>
+                <w:szCs w:val="20"/>
+                <w:rtl w:val="0"/>
+              </w:rPr>
+              <w:t xml:space="preserve">CP-09 </w:t>
+            </w:r>
+          </w:p>
+        </w:tc>
+        <w:tc>
+          <w:tcPr>
+            <w:tcBorders>
+              <w:top w:color="000000" w:space="0" w:sz="4" w:val="single"/>
+              <w:left w:color="000000" w:space="0" w:sz="4" w:val="single"/>
+              <w:bottom w:color="000000" w:space="0" w:sz="4" w:val="single"/>
+              <w:right w:color="000000" w:space="0" w:sz="4" w:val="single"/>
+            </w:tcBorders>
+            <w:tcMar>
+              <w:top w:w="60.0" w:type="dxa"/>
+              <w:left w:w="100.0" w:type="dxa"/>
+              <w:bottom w:w="60.0" w:type="dxa"/>
+              <w:right w:w="100.0" w:type="dxa"/>
+            </w:tcMar>
+            <w:vAlign w:val="top"/>
+          </w:tcPr>
+          <w:p>
+            <w:pPr>
+              <w:spacing w:after="20" w:line="240" w:lineRule="auto"/>
+              <w:jc w:val="both"/>
+              <w:rPr/>
+            </w:pPr>
+            <w:r>
+              <w:rPr>
+                <w:rtl w:val="0"/>
+              </w:rPr>
+              <w:t xml:space="preserve">Dejar un campo obligatorio vacío y hacer clic en "Enviar" </w:t>
+            </w:r>
+          </w:p>
+        </w:tc>
+        <w:tc>
+          <w:tcPr>
+            <w:tcBorders>
+              <w:top w:color="000000" w:space="0" w:sz="4" w:val="single"/>
+              <w:left w:color="000000" w:space="0" w:sz="4" w:val="single"/>
+              <w:bottom w:color="000000" w:space="0" w:sz="4" w:val="single"/>
+              <w:right w:color="000000" w:space="0" w:sz="4" w:val="single"/>
+            </w:tcBorders>
+            <w:tcMar>
+              <w:top w:w="60.0" w:type="dxa"/>
+              <w:left w:w="100.0" w:type="dxa"/>
+              <w:bottom w:w="60.0" w:type="dxa"/>
+              <w:right w:w="100.0" w:type="dxa"/>
+            </w:tcMar>
+            <w:vAlign w:val="top"/>
+          </w:tcPr>
+          <w:p>
+            <w:pPr>
+              <w:spacing w:after="20" w:line="240" w:lineRule="auto"/>
+              <w:jc w:val="both"/>
+              <w:rPr/>
+            </w:pPr>
+            <w:r>
+              <w:rPr>
+                <w:rtl w:val="0"/>
+              </w:rPr>
+              <w:t xml:space="preserve">El envío se cancela y el foco se mueve al primer campo con error </w:t>
+            </w:r>
+          </w:p>
+        </w:tc>
+        <w:tc>
+          <w:tcPr>
+            <w:tcBorders>
+              <w:top w:color="000000" w:space="0" w:sz="4" w:val="single"/>
+              <w:left w:color="000000" w:space="0" w:sz="4" w:val="single"/>
+              <w:bottom w:color="000000" w:space="0" w:sz="4" w:val="single"/>
+              <w:right w:color="000000" w:space="0" w:sz="4" w:val="single"/>
+            </w:tcBorders>
+            <w:tcMar>
+              <w:top w:w="60.0" w:type="dxa"/>
+              <w:left w:w="100.0" w:type="dxa"/>
+              <w:bottom w:w="60.0" w:type="dxa"/>
+              <w:right w:w="100.0" w:type="dxa"/>
+            </w:tcMar>
+            <w:vAlign w:val="top"/>
+          </w:tcPr>
+          <w:p>
+            <w:pPr>
+              <w:spacing w:after="20" w:line="240" w:lineRule="auto"/>
+              <w:jc w:val="both"/>
+              <w:rPr/>
+            </w:pPr>
+            <w:r>
+              <w:rPr>
+                <w:rtl w:val="0"/>
+              </w:rPr>
+              <w:t xml:space="preserve">Pendiente </w:t>
             </w:r>
           </w:p>
         </w:tc>
@@ -32039,7 +32017,8 @@
           <w:between w:color="auto" w:space="0" w:sz="0" w:val="none"/>
         </w:pBdr>
         <w:shd w:fill="ffffff" w:val="clear"/>
-        <w:spacing w:after="120" w:before="360" w:lineRule="auto"/>
+        <w:spacing w:after="120" w:before="360" w:line="360" w:lineRule="auto"/>
+        <w:jc w:val="both"/>
         <w:rPr>
           <w:b w:val="1"/>
           <w:bCs w:val="1"/>
@@ -32064,6 +32043,8 @@
           <w:between w:color="auto" w:space="0" w:sz="0" w:val="none"/>
         </w:pBdr>
         <w:shd w:fill="ffffff" w:val="clear"/>
+        <w:spacing w:line="360" w:lineRule="auto"/>
+        <w:jc w:val="both"/>
         <w:rPr/>
       </w:pPr>
       <w:r>
@@ -32083,7 +32064,8 @@
           <w:between w:color="auto" w:space="0" w:sz="0" w:val="none"/>
         </w:pBdr>
         <w:shd w:fill="ffffff" w:val="clear"/>
-        <w:spacing w:after="120" w:before="360" w:lineRule="auto"/>
+        <w:spacing w:after="120" w:before="360" w:line="360" w:lineRule="auto"/>
+        <w:jc w:val="both"/>
         <w:rPr>
           <w:b w:val="1"/>
           <w:bCs w:val="1"/>
@@ -32108,6 +32090,8 @@
           <w:between w:color="auto" w:space="0" w:sz="0" w:val="none"/>
         </w:pBdr>
         <w:shd w:fill="ffffff" w:val="clear"/>
+        <w:spacing w:line="360" w:lineRule="auto"/>
+        <w:jc w:val="both"/>
         <w:rPr/>
       </w:pPr>
       <w:r>

</xml_diff>

<commit_message>
docs: versión final sin revisar por Calidad
</commit_message>
<xml_diff>
--- a/documentos/Documento_Diseno_Iteracion_1_Grupo_4.docx
+++ b/documentos/Documento_Diseno_Iteracion_1_Grupo_4.docx
@@ -14,12 +14,12 @@
           <wp:inline distB="0" distT="0" distL="0" distR="0">
             <wp:extent cx="1809750" cy="876300"/>
             <wp:effectExtent b="0" l="0" r="0" t="0"/>
-            <wp:docPr descr="Logo Universidad CENFOTEC" id="11" name="image5.png"/>
+            <wp:docPr descr="Logo Universidad CENFOTEC" id="11" name="image3.png"/>
             <a:graphic>
               <a:graphicData uri="http://schemas.openxmlformats.org/drawingml/2006/picture">
                 <pic:pic>
                   <pic:nvPicPr>
-                    <pic:cNvPr descr="Logo Universidad CENFOTEC" id="0" name="image5.png"/>
+                    <pic:cNvPr descr="Logo Universidad CENFOTEC" id="0" name="image3.png"/>
                     <pic:cNvPicPr preferRelativeResize="0"/>
                   </pic:nvPicPr>
                   <pic:blipFill>
@@ -286,7 +286,7 @@
     </w:p>
     <w:sdt>
       <w:sdtPr>
-        <w:id w:val="-771773304"/>
+        <w:id w:val="613378341"/>
         <w:docPartObj>
           <w:docPartGallery w:val="Table of Contents"/>
           <w:docPartUnique w:val="1"/>
@@ -5612,12 +5612,12 @@
           <wp:inline distB="0" distT="0" distL="0" distR="0">
             <wp:extent cx="5619750" cy="3467100"/>
             <wp:effectExtent b="0" l="0" r="0" t="0"/>
-            <wp:docPr descr="Página de inicio de sesión (index.html)" id="7" name="image2.png"/>
+            <wp:docPr descr="Página de inicio de sesión (index.html)" id="7" name="image1.png"/>
             <a:graphic>
               <a:graphicData uri="http://schemas.openxmlformats.org/drawingml/2006/picture">
                 <pic:pic>
                   <pic:nvPicPr>
-                    <pic:cNvPr descr="Página de inicio de sesión (index.html)" id="0" name="image2.png"/>
+                    <pic:cNvPr descr="Página de inicio de sesión (index.html)" id="0" name="image1.png"/>
                     <pic:cNvPicPr preferRelativeResize="0"/>
                   </pic:nvPicPr>
                   <pic:blipFill>
@@ -5732,12 +5732,12 @@
           <wp:inline distB="0" distT="0" distL="0" distR="0">
             <wp:extent cx="5619750" cy="3286125"/>
             <wp:effectExtent b="0" l="0" r="0" t="0"/>
-            <wp:docPr descr="Panel de inicio (inicio.html)" id="1" name="image12.png"/>
+            <wp:docPr descr="Panel de inicio (inicio.html)" id="1" name="image7.png"/>
             <a:graphic>
               <a:graphicData uri="http://schemas.openxmlformats.org/drawingml/2006/picture">
                 <pic:pic>
                   <pic:nvPicPr>
-                    <pic:cNvPr descr="Panel de inicio (inicio.html)" id="0" name="image12.png"/>
+                    <pic:cNvPr descr="Panel de inicio (inicio.html)" id="0" name="image7.png"/>
                     <pic:cNvPicPr preferRelativeResize="0"/>
                   </pic:nvPicPr>
                   <pic:blipFill>
@@ -5852,12 +5852,12 @@
           <wp:inline distB="0" distT="0" distL="0" distR="0">
             <wp:extent cx="5619750" cy="4781550"/>
             <wp:effectExtent b="0" l="0" r="0" t="0"/>
-            <wp:docPr descr="Gestión de usuarios (usuarios.html)" id="4" name="image9.png"/>
+            <wp:docPr descr="Gestión de usuarios (usuarios.html)" id="4" name="image4.png"/>
             <a:graphic>
               <a:graphicData uri="http://schemas.openxmlformats.org/drawingml/2006/picture">
                 <pic:pic>
                   <pic:nvPicPr>
-                    <pic:cNvPr descr="Gestión de usuarios (usuarios.html)" id="0" name="image9.png"/>
+                    <pic:cNvPr descr="Gestión de usuarios (usuarios.html)" id="0" name="image4.png"/>
                     <pic:cNvPicPr preferRelativeResize="0"/>
                   </pic:nvPicPr>
                   <pic:blipFill>
@@ -5972,12 +5972,12 @@
           <wp:inline distB="0" distT="0" distL="0" distR="0">
             <wp:extent cx="5619750" cy="3552825"/>
             <wp:effectExtent b="0" l="0" r="0" t="0"/>
-            <wp:docPr descr="Perfil del usuario (perfil.html)" id="2" name="image4.png"/>
+            <wp:docPr descr="Perfil del usuario (perfil.html)" id="2" name="image11.png"/>
             <a:graphic>
               <a:graphicData uri="http://schemas.openxmlformats.org/drawingml/2006/picture">
                 <pic:pic>
                   <pic:nvPicPr>
-                    <pic:cNvPr descr="Perfil del usuario (perfil.html)" id="0" name="image4.png"/>
+                    <pic:cNvPr descr="Perfil del usuario (perfil.html)" id="0" name="image11.png"/>
                     <pic:cNvPicPr preferRelativeResize="0"/>
                   </pic:nvPicPr>
                   <pic:blipFill>
@@ -6092,12 +6092,12 @@
           <wp:inline distB="0" distT="0" distL="0" distR="0">
             <wp:extent cx="5619750" cy="3638550"/>
             <wp:effectExtent b="0" l="0" r="0" t="0"/>
-            <wp:docPr descr="Gestión de catálogos (catalogos.html)" id="10" name="image10.png"/>
+            <wp:docPr descr="Gestión de catálogos (catalogos.html)" id="10" name="image6.png"/>
             <a:graphic>
               <a:graphicData uri="http://schemas.openxmlformats.org/drawingml/2006/picture">
                 <pic:pic>
                   <pic:nvPicPr>
-                    <pic:cNvPr descr="Gestión de catálogos (catalogos.html)" id="0" name="image10.png"/>
+                    <pic:cNvPr descr="Gestión de catálogos (catalogos.html)" id="0" name="image6.png"/>
                     <pic:cNvPicPr preferRelativeResize="0"/>
                   </pic:nvPicPr>
                   <pic:blipFill>
@@ -6212,12 +6212,12 @@
           <wp:inline distB="0" distT="0" distL="0" distR="0">
             <wp:extent cx="5619750" cy="5562600"/>
             <wp:effectExtent b="0" l="0" r="0" t="0"/>
-            <wp:docPr descr="Formulario del curso, parte 1 de 2 (curso-formulario.html)" id="9" name="image3.png"/>
+            <wp:docPr descr="Formulario del curso, parte 1 de 2 (curso-formulario.html)" id="9" name="image8.png"/>
             <a:graphic>
               <a:graphicData uri="http://schemas.openxmlformats.org/drawingml/2006/picture">
                 <pic:pic>
                   <pic:nvPicPr>
-                    <pic:cNvPr descr="Formulario del curso, parte 1 de 2 (curso-formulario.html)" id="0" name="image3.png"/>
+                    <pic:cNvPr descr="Formulario del curso, parte 1 de 2 (curso-formulario.html)" id="0" name="image8.png"/>
                     <pic:cNvPicPr preferRelativeResize="0"/>
                   </pic:nvPicPr>
                   <pic:blipFill>
@@ -6332,12 +6332,12 @@
           <wp:inline distB="0" distT="0" distL="0" distR="0">
             <wp:extent cx="5619750" cy="6200775"/>
             <wp:effectExtent b="0" l="0" r="0" t="0"/>
-            <wp:docPr descr="Formulario del curso, parte 2 de 2 (curso-formulario.html)" id="3" name="image1.png"/>
+            <wp:docPr descr="Formulario del curso, parte 2 de 2 (curso-formulario.html)" id="3" name="image10.png"/>
             <a:graphic>
               <a:graphicData uri="http://schemas.openxmlformats.org/drawingml/2006/picture">
                 <pic:pic>
                   <pic:nvPicPr>
-                    <pic:cNvPr descr="Formulario del curso, parte 2 de 2 (curso-formulario.html)" id="0" name="image1.png"/>
+                    <pic:cNvPr descr="Formulario del curso, parte 2 de 2 (curso-formulario.html)" id="0" name="image10.png"/>
                     <pic:cNvPicPr preferRelativeResize="0"/>
                   </pic:nvPicPr>
                   <pic:blipFill>
@@ -6452,12 +6452,12 @@
           <wp:inline distB="0" distT="0" distL="0" distR="0">
             <wp:extent cx="5619750" cy="2933700"/>
             <wp:effectExtent b="0" l="0" r="0" t="0"/>
-            <wp:docPr descr="Lista de cursos con filtros (cursos.html)" id="8" name="image7.png"/>
+            <wp:docPr descr="Lista de cursos con filtros (cursos.html)" id="8" name="image2.png"/>
             <a:graphic>
               <a:graphicData uri="http://schemas.openxmlformats.org/drawingml/2006/picture">
                 <pic:pic>
                   <pic:nvPicPr>
-                    <pic:cNvPr descr="Lista de cursos con filtros (cursos.html)" id="0" name="image7.png"/>
+                    <pic:cNvPr descr="Lista de cursos con filtros (cursos.html)" id="0" name="image2.png"/>
                     <pic:cNvPicPr preferRelativeResize="0"/>
                   </pic:nvPicPr>
                   <pic:blipFill>
@@ -6572,12 +6572,12 @@
           <wp:inline distB="0" distT="0" distL="0" distR="0">
             <wp:extent cx="5619750" cy="3771900"/>
             <wp:effectExtent b="0" l="0" r="0" t="0"/>
-            <wp:docPr descr="Detalle del curso (curso-detalle.html)" id="12" name="image6.png"/>
+            <wp:docPr descr="Detalle del curso (curso-detalle.html)" id="12" name="image12.png"/>
             <a:graphic>
               <a:graphicData uri="http://schemas.openxmlformats.org/drawingml/2006/picture">
                 <pic:pic>
                   <pic:nvPicPr>
-                    <pic:cNvPr descr="Detalle del curso (curso-detalle.html)" id="0" name="image6.png"/>
+                    <pic:cNvPr descr="Detalle del curso (curso-detalle.html)" id="0" name="image12.png"/>
                     <pic:cNvPicPr preferRelativeResize="0"/>
                   </pic:nvPicPr>
                   <pic:blipFill>
@@ -6692,12 +6692,12 @@
           <wp:inline distB="0" distT="0" distL="0" distR="0">
             <wp:extent cx="5619750" cy="4248150"/>
             <wp:effectExtent b="0" l="0" r="0" t="0"/>
-            <wp:docPr descr="Bandeja de revisión (revision.html)" id="6" name="image11.png"/>
+            <wp:docPr descr="Bandeja de revisión (revision.html)" id="6" name="image9.png"/>
             <a:graphic>
               <a:graphicData uri="http://schemas.openxmlformats.org/drawingml/2006/picture">
                 <pic:pic>
                   <pic:nvPicPr>
-                    <pic:cNvPr descr="Bandeja de revisión (revision.html)" id="0" name="image11.png"/>
+                    <pic:cNvPr descr="Bandeja de revisión (revision.html)" id="0" name="image9.png"/>
                     <pic:cNvPicPr preferRelativeResize="0"/>
                   </pic:nvPicPr>
                   <pic:blipFill>
@@ -6812,12 +6812,12 @@
           <wp:inline distB="0" distT="0" distL="0" distR="0">
             <wp:extent cx="4476750" cy="4295775"/>
             <wp:effectExtent b="0" l="0" r="0" t="0"/>
-            <wp:docPr descr="Vista en dispositivo móvil (inicio.html y curso-formulario.html)" id="5" name="image8.png"/>
+            <wp:docPr descr="Vista en dispositivo móvil (inicio.html y curso-formulario.html)" id="5" name="image5.png"/>
             <a:graphic>
               <a:graphicData uri="http://schemas.openxmlformats.org/drawingml/2006/picture">
                 <pic:pic>
                   <pic:nvPicPr>
-                    <pic:cNvPr descr="Vista en dispositivo móvil (inicio.html y curso-formulario.html)" id="0" name="image8.png"/>
+                    <pic:cNvPr descr="Vista en dispositivo móvil (inicio.html y curso-formulario.html)" id="0" name="image5.png"/>
                     <pic:cNvPicPr preferRelativeResize="0"/>
                   </pic:nvPicPr>
                   <pic:blipFill>

</xml_diff>